<commit_message>
fix(mcp): cross-event-loop tool call hang via sync bridge
Root cause: session.call_tool() was awaited from the main event loop,
but the MCP session was created on a background event loop. The MCP SDK
uses anyio internally, so cross-loop calls hang indefinitely.

Fix (hermes pattern):
- Add MCPManager.set_mcp_loop() to store background loop reference
- Add MCPManager.call_tool_sync() using run_coroutine_threadsafe()
- MCPToolAdapter._call_mcp() uses call_tool_sync when available
- Add RPC serialization lock (_rpc_lock) to _MCPServer
- Wrap session.call_tool() with asyncio.wait_for() timeout
</commit_message>
<xml_diff>
--- a/report/创新实践设计报告.docx
+++ b/report/创新实践设计报告.docx
@@ -363,7 +363,6 @@
         </w:rPr>
         <w:t xml:space="preserve">                   </w:t>
       </w:r>
-      <w:proofErr w:type="gramStart"/>
       <w:r>
         <w:rPr>
           <w:rFonts w:eastAsia="黑体" w:hint="eastAsia"/>
@@ -373,7 +372,6 @@
         </w:rPr>
         <w:t>网安</w:t>
       </w:r>
-      <w:proofErr w:type="gramEnd"/>
       <w:r>
         <w:rPr>
           <w:rFonts w:eastAsia="黑体" w:hint="eastAsia"/>
@@ -742,12 +740,14 @@
         </w:rPr>
         <w:t>本文设计并实现了一个名为</w:t>
       </w:r>
+      <w:proofErr w:type="spellStart"/>
       <w:r>
         <w:rPr>
           <w:lang w:eastAsia="zh-CN"/>
         </w:rPr>
         <w:t>GrassFlow</w:t>
       </w:r>
+      <w:proofErr w:type="spellEnd"/>
       <w:r>
         <w:rPr>
           <w:lang w:eastAsia="zh-CN"/>
@@ -764,21 +764,7 @@
         <w:rPr>
           <w:lang w:eastAsia="zh-CN"/>
         </w:rPr>
-        <w:t>积木编排平台。平台采用声明</w:t>
-      </w:r>
-      <w:proofErr w:type="gramStart"/>
-      <w:r>
-        <w:rPr>
-          <w:lang w:eastAsia="zh-CN"/>
-        </w:rPr>
-        <w:t>式领域</w:t>
-      </w:r>
-      <w:proofErr w:type="gramEnd"/>
-      <w:r>
-        <w:rPr>
-          <w:lang w:eastAsia="zh-CN"/>
-        </w:rPr>
-        <w:t>特定语言</w:t>
+        <w:t>积木编排平台。平台采用声明式领域特定语言</w:t>
       </w:r>
       <w:r>
         <w:rPr>
@@ -802,21 +788,7 @@
         <w:rPr>
           <w:lang w:eastAsia="zh-CN"/>
         </w:rPr>
-        <w:t>之间的依赖关系，系统自动解析执行顺序和并行调度。用户只需通过简洁的文本语法</w:t>
-      </w:r>
-      <w:proofErr w:type="gramStart"/>
-      <w:r>
-        <w:rPr>
-          <w:lang w:eastAsia="zh-CN"/>
-        </w:rPr>
-        <w:t>声明谁</w:t>
-      </w:r>
-      <w:proofErr w:type="gramEnd"/>
-      <w:r>
-        <w:rPr>
-          <w:lang w:eastAsia="zh-CN"/>
-        </w:rPr>
-        <w:t>依赖谁，系统即可自动完成拓扑排序、并行分组、异步调度等复杂的执行逻辑。这种声明式的编程范式大大降低了多</w:t>
+        <w:t>之间的依赖关系，系统自动解析执行顺序和并行调度。用户只需通过简洁的文本语法声明谁依赖谁，系统即可自动完成拓扑排序、并行分组、异步调度等复杂的执行逻辑。这种声明式的编程范式大大降低了多</w:t>
       </w:r>
       <w:r>
         <w:rPr>
@@ -881,24 +853,28 @@
         </w:rPr>
         <w:t>依赖关系并生成并行执行分组，能够在构造阶段快速检测环形依赖并抛出异常。第二是基于</w:t>
       </w:r>
+      <w:proofErr w:type="spellStart"/>
       <w:r>
         <w:rPr>
           <w:lang w:eastAsia="zh-CN"/>
         </w:rPr>
         <w:t>asyncio</w:t>
       </w:r>
+      <w:proofErr w:type="spellEnd"/>
       <w:r>
         <w:rPr>
           <w:lang w:eastAsia="zh-CN"/>
         </w:rPr>
         <w:t>的异步调度器，在组内通过</w:t>
       </w:r>
+      <w:proofErr w:type="spellStart"/>
       <w:r>
         <w:rPr>
           <w:lang w:eastAsia="zh-CN"/>
         </w:rPr>
         <w:t>asyncio.gather</w:t>
       </w:r>
+      <w:proofErr w:type="spellEnd"/>
       <w:r>
         <w:rPr>
           <w:lang w:eastAsia="zh-CN"/>
@@ -1088,12 +1064,14 @@
         </w:rPr>
         <w:t>语言开发，后端基于</w:t>
       </w:r>
+      <w:proofErr w:type="spellStart"/>
       <w:r>
         <w:rPr>
           <w:lang w:eastAsia="zh-CN"/>
         </w:rPr>
         <w:t>FastAPI</w:t>
       </w:r>
+      <w:proofErr w:type="spellEnd"/>
       <w:r>
         <w:rPr>
           <w:lang w:eastAsia="zh-CN"/>
@@ -1112,12 +1090,14 @@
         </w:rPr>
         <w:t>和</w:t>
       </w:r>
+      <w:proofErr w:type="spellStart"/>
       <w:r>
         <w:rPr>
           <w:lang w:eastAsia="zh-CN"/>
         </w:rPr>
         <w:t>prompt_toolkit</w:t>
       </w:r>
+      <w:proofErr w:type="spellEnd"/>
       <w:r>
         <w:rPr>
           <w:lang w:eastAsia="zh-CN"/>
@@ -1296,7 +1276,15 @@
         <w:ind w:firstLine="480"/>
       </w:pPr>
       <w:r>
-        <w:t>This thesis designs and implements a visual multi-agent block orchestration platform called GrassFlow. The platform uses a declarative domain-specific language to describe dependencies between agents, with the system automatically resolving execution order and parallel scheduling. Users only need to declare who depends on whom through concise text syntax, and the system automatically completes topological sorting, parallel grouping, and asynchronous scheduling. This declarative programming paradigm significantly lowers the barrier to creating multi-agent workflows.</w:t>
+        <w:t xml:space="preserve">This thesis designs and implements a visual multi-agent block orchestration platform called </w:t>
+      </w:r>
+      <w:proofErr w:type="spellStart"/>
+      <w:r>
+        <w:t>GrassFlow</w:t>
+      </w:r>
+      <w:proofErr w:type="spellEnd"/>
+      <w:r>
+        <w:t>. The platform uses a declarative domain-specific language to describe dependencies between agents, with the system automatically resolving execution order and parallel scheduling. Users only need to declare who depends on whom through concise text syntax, and the system automatically completes topological sorting, parallel grouping, and asynchronous scheduling. This declarative programming paradigm significantly lowers the barrier to creating multi-agent workflows.</w:t>
       </w:r>
     </w:p>
     <w:p>
@@ -1305,7 +1293,23 @@
         <w:ind w:firstLine="480"/>
       </w:pPr>
       <w:r>
-        <w:t>The core architecture consists of four key modules: a DAG topological sorting engine based on Kahn's algorithm for parsing agent dependencies and generating parallel execution groups, with fast cycle detection at construction time; an asyncio-based asynchronous scheduler that executes agents concurrently within groups using asyncio.gather while maintaining sequential constraints between groups, supporting both batch and stream execution modes; an LLM agent with tool calling capability that interacts with external tools through an iterative tool calling loop with a maximum of 10 rounds, supporting per-agent permission filtering; and a rule-based intent detection module that recognizes Chinese natural language patterns such as first X then Y and compare X with Y, automatically converting them into DSL workflow definitions.</w:t>
+        <w:t xml:space="preserve">The core architecture consists of four key modules: a DAG topological sorting engine based on Kahn's algorithm for parsing agent dependencies and generating parallel execution groups, with fast cycle detection at construction time; an </w:t>
+      </w:r>
+      <w:proofErr w:type="spellStart"/>
+      <w:r>
+        <w:t>asyncio</w:t>
+      </w:r>
+      <w:proofErr w:type="spellEnd"/>
+      <w:r>
+        <w:t xml:space="preserve">-based asynchronous scheduler that executes agents concurrently within groups using </w:t>
+      </w:r>
+      <w:proofErr w:type="spellStart"/>
+      <w:r>
+        <w:t>asyncio.gather</w:t>
+      </w:r>
+      <w:proofErr w:type="spellEnd"/>
+      <w:r>
+        <w:t xml:space="preserve"> while maintaining sequential constraints between groups, supporting both batch and stream execution modes; an LLM agent with tool calling capability that interacts with external tools through an iterative tool calling loop with a maximum of 10 rounds, supporting per-agent permission filtering; and a rule-based intent detection module that recognizes Chinese natural language patterns such as first X then Y and compare X with Y, automatically converting them into DSL workflow definitions.</w:t>
       </w:r>
     </w:p>
     <w:p>
@@ -1314,7 +1318,23 @@
         <w:ind w:firstLine="480"/>
       </w:pPr>
       <w:r>
-        <w:t xml:space="preserve">The system is developed in Python with the backend based on the FastAPI framework and the terminal interface implemented using Rich and prompt_toolkit libraries. The project contains 112 Python source files with approximately 58,000 lines of code. System correctness has been verified through 1,372 automated test cases covering all major modules. Tests run in GitHub Actions CI environment across Python 3.10, 3.11, and 3.12. Results show that the DAG engine correctly handles complex dependency </w:t>
+        <w:t xml:space="preserve">The system is developed in Python with the backend based on the </w:t>
+      </w:r>
+      <w:proofErr w:type="spellStart"/>
+      <w:r>
+        <w:t>FastAPI</w:t>
+      </w:r>
+      <w:proofErr w:type="spellEnd"/>
+      <w:r>
+        <w:t xml:space="preserve"> framework and the terminal interface implemented using Rich and </w:t>
+      </w:r>
+      <w:proofErr w:type="spellStart"/>
+      <w:r>
+        <w:t>prompt_toolkit</w:t>
+      </w:r>
+      <w:proofErr w:type="spellEnd"/>
+      <w:r>
+        <w:t xml:space="preserve"> libraries. The project contains 112 Python source files with approximately 58,000 lines of code. System correctness has been verified through 1,372 automated test cases covering all major modules. Tests run in GitHub Actions CI environment across Python 3.10, 3.11, and 3.12. Results show that the DAG engine correctly handles complex dependency </w:t>
       </w:r>
       <w:r>
         <w:lastRenderedPageBreak/>
@@ -4570,11 +4590,13 @@
       <w:r>
         <w:t xml:space="preserve">1.1 </w:t>
       </w:r>
+      <w:proofErr w:type="spellStart"/>
       <w:r>
         <w:t>项目背景</w:t>
       </w:r>
       <w:bookmarkEnd w:id="2"/>
       <w:bookmarkEnd w:id="4"/>
+      <w:proofErr w:type="spellEnd"/>
     </w:p>
     <w:p>
       <w:pPr>
@@ -4584,12 +4606,14 @@
           <w:lang w:eastAsia="zh-CN"/>
         </w:rPr>
       </w:pPr>
+      <w:proofErr w:type="spellStart"/>
       <w:r>
         <w:rPr>
           <w:rFonts w:hint="eastAsia"/>
         </w:rPr>
         <w:t>近年来，大语言模型</w:t>
       </w:r>
+      <w:proofErr w:type="spellEnd"/>
       <w:r>
         <w:rPr>
           <w:rFonts w:hint="eastAsia"/>
@@ -4967,12 +4991,14 @@
         </w:rPr>
         <w:t>编排工具存在以下问题。第一，交互方式单一。</w:t>
       </w:r>
+      <w:proofErr w:type="spellStart"/>
       <w:r>
         <w:rPr>
           <w:lang w:eastAsia="zh-CN"/>
         </w:rPr>
         <w:t>Langflow</w:t>
       </w:r>
+      <w:proofErr w:type="spellEnd"/>
       <w:r>
         <w:rPr>
           <w:lang w:eastAsia="zh-CN"/>
@@ -5003,12 +5029,14 @@
         </w:rPr>
         <w:t>自动生成；</w:t>
       </w:r>
+      <w:proofErr w:type="spellStart"/>
       <w:r>
         <w:rPr>
           <w:lang w:eastAsia="zh-CN"/>
         </w:rPr>
         <w:t>CrewAI</w:t>
       </w:r>
+      <w:proofErr w:type="spellEnd"/>
       <w:r>
         <w:rPr>
           <w:lang w:eastAsia="zh-CN"/>
@@ -5102,12 +5130,14 @@
         </w:rPr>
         <w:t>本文设计并实现了一个名为</w:t>
       </w:r>
+      <w:proofErr w:type="spellStart"/>
       <w:r>
         <w:rPr>
           <w:lang w:eastAsia="zh-CN"/>
         </w:rPr>
         <w:t>GrassFlow</w:t>
       </w:r>
+      <w:proofErr w:type="spellEnd"/>
       <w:r>
         <w:rPr>
           <w:lang w:eastAsia="zh-CN"/>
@@ -5126,11 +5156,19 @@
         </w:rPr>
         <w:t>积木编排平台。平台的核心设计理念是用户只需声明谁依赖谁，系统自动处理执行顺序和并行调度。取名</w:t>
       </w:r>
-      <w:r>
-        <w:rPr>
-          <w:lang w:eastAsia="zh-CN"/>
-        </w:rPr>
-        <w:t>GrassFlow(</w:t>
+      <w:proofErr w:type="spellStart"/>
+      <w:r>
+        <w:rPr>
+          <w:lang w:eastAsia="zh-CN"/>
+        </w:rPr>
+        <w:t>GrassFlow</w:t>
+      </w:r>
+      <w:proofErr w:type="spellEnd"/>
+      <w:r>
+        <w:rPr>
+          <w:lang w:eastAsia="zh-CN"/>
+        </w:rPr>
+        <w:t>(</w:t>
       </w:r>
       <w:r>
         <w:rPr>
@@ -5385,12 +5423,14 @@
         </w:rPr>
         <w:t>为边数。调度器基于</w:t>
       </w:r>
+      <w:proofErr w:type="spellStart"/>
       <w:r>
         <w:rPr>
           <w:lang w:eastAsia="zh-CN"/>
         </w:rPr>
         <w:t>asyncio</w:t>
       </w:r>
+      <w:proofErr w:type="spellEnd"/>
       <w:r>
         <w:rPr>
           <w:lang w:eastAsia="zh-CN"/>
@@ -5670,12 +5710,14 @@
         </w:rPr>
         <w:t>终端基于</w:t>
       </w:r>
+      <w:proofErr w:type="spellStart"/>
       <w:r>
         <w:rPr>
           <w:lang w:eastAsia="zh-CN"/>
         </w:rPr>
         <w:t>prompt_toolkit</w:t>
       </w:r>
+      <w:proofErr w:type="spellEnd"/>
       <w:r>
         <w:rPr>
           <w:lang w:eastAsia="zh-CN"/>
@@ -5966,12 +6008,14 @@
           <w:lang w:eastAsia="zh-CN"/>
         </w:rPr>
       </w:pPr>
+      <w:proofErr w:type="spellStart"/>
       <w:r>
         <w:rPr>
           <w:lang w:eastAsia="zh-CN"/>
         </w:rPr>
         <w:t>GrassFlow</w:t>
       </w:r>
+      <w:proofErr w:type="spellEnd"/>
       <w:r>
         <w:rPr>
           <w:lang w:eastAsia="zh-CN"/>
@@ -6077,12 +6121,14 @@
         </w:rPr>
         <w:t>与同类工具相比，</w:t>
       </w:r>
+      <w:proofErr w:type="spellStart"/>
       <w:r>
         <w:rPr>
           <w:lang w:eastAsia="zh-CN"/>
         </w:rPr>
         <w:t>GrassFlow</w:t>
       </w:r>
+      <w:proofErr w:type="spellEnd"/>
       <w:r>
         <w:rPr>
           <w:lang w:eastAsia="zh-CN"/>
@@ -6288,7 +6334,21 @@
         <w:rPr>
           <w:lang w:eastAsia="zh-CN"/>
         </w:rPr>
-        <w:t>(system_prompt)</w:t>
+        <w:t>(</w:t>
+      </w:r>
+      <w:proofErr w:type="spellStart"/>
+      <w:r>
+        <w:rPr>
+          <w:lang w:eastAsia="zh-CN"/>
+        </w:rPr>
+        <w:t>system_prompt</w:t>
+      </w:r>
+      <w:proofErr w:type="spellEnd"/>
+      <w:r>
+        <w:rPr>
+          <w:lang w:eastAsia="zh-CN"/>
+        </w:rPr>
+        <w:t>)</w:t>
       </w:r>
       <w:r>
         <w:rPr>
@@ -6336,7 +6396,21 @@
         <w:rPr>
           <w:lang w:eastAsia="zh-CN"/>
         </w:rPr>
-        <w:t>(mcp)</w:t>
+        <w:t>(</w:t>
+      </w:r>
+      <w:proofErr w:type="spellStart"/>
+      <w:r>
+        <w:rPr>
+          <w:lang w:eastAsia="zh-CN"/>
+        </w:rPr>
+        <w:t>mcp</w:t>
+      </w:r>
+      <w:proofErr w:type="spellEnd"/>
+      <w:r>
+        <w:rPr>
+          <w:lang w:eastAsia="zh-CN"/>
+        </w:rPr>
+        <w:t>)</w:t>
       </w:r>
       <w:r>
         <w:rPr>
@@ -6384,7 +6458,21 @@
         <w:rPr>
           <w:lang w:eastAsia="zh-CN"/>
         </w:rPr>
-        <w:t>(on_fail: stop/skip/retry)</w:t>
+        <w:t>(</w:t>
+      </w:r>
+      <w:proofErr w:type="spellStart"/>
+      <w:r>
+        <w:rPr>
+          <w:lang w:eastAsia="zh-CN"/>
+        </w:rPr>
+        <w:t>on_fail</w:t>
+      </w:r>
+      <w:proofErr w:type="spellEnd"/>
+      <w:r>
+        <w:rPr>
+          <w:lang w:eastAsia="zh-CN"/>
+        </w:rPr>
+        <w:t>: stop/skip/retry)</w:t>
       </w:r>
       <w:r>
         <w:rPr>
@@ -7290,12 +7378,14 @@
         </w:rPr>
         <w:t>类似</w:t>
       </w:r>
+      <w:proofErr w:type="spellStart"/>
       <w:r>
         <w:rPr>
           <w:lang w:eastAsia="zh-CN"/>
         </w:rPr>
         <w:t>htop</w:t>
       </w:r>
+      <w:proofErr w:type="spellEnd"/>
       <w:r>
         <w:rPr>
           <w:lang w:eastAsia="zh-CN"/>
@@ -7377,12 +7467,14 @@
         </w:rPr>
         <w:t>在性能方面，调度器应充分利用</w:t>
       </w:r>
+      <w:proofErr w:type="spellStart"/>
       <w:r>
         <w:rPr>
           <w:lang w:eastAsia="zh-CN"/>
         </w:rPr>
         <w:t>asyncio</w:t>
       </w:r>
+      <w:proofErr w:type="spellEnd"/>
       <w:r>
         <w:rPr>
           <w:lang w:eastAsia="zh-CN"/>
@@ -7739,12 +7831,14 @@
           <w:lang w:eastAsia="zh-CN"/>
         </w:rPr>
       </w:pPr>
+      <w:proofErr w:type="spellStart"/>
       <w:r>
         <w:rPr>
           <w:lang w:eastAsia="zh-CN"/>
         </w:rPr>
         <w:t>GrassFlow</w:t>
       </w:r>
+      <w:proofErr w:type="spellEnd"/>
       <w:r>
         <w:rPr>
           <w:lang w:eastAsia="zh-CN"/>
@@ -7802,12 +7896,14 @@
         </w:rPr>
         <w:t>、</w:t>
       </w:r>
+      <w:proofErr w:type="spellStart"/>
       <w:r>
         <w:rPr>
           <w:lang w:eastAsia="zh-CN"/>
         </w:rPr>
         <w:t>AgentInstance</w:t>
       </w:r>
+      <w:proofErr w:type="spellEnd"/>
       <w:r>
         <w:rPr>
           <w:lang w:eastAsia="zh-CN"/>
@@ -8055,8 +8151,16 @@
         <w:rPr>
           <w:lang w:eastAsia="zh-CN"/>
         </w:rPr>
-        <w:t>3-1 GrassFlow</w:t>
-      </w:r>
+        <w:t xml:space="preserve">3-1 </w:t>
+      </w:r>
+      <w:proofErr w:type="spellStart"/>
+      <w:r>
+        <w:rPr>
+          <w:lang w:eastAsia="zh-CN"/>
+        </w:rPr>
+        <w:t>GrassFlow</w:t>
+      </w:r>
+      <w:proofErr w:type="spellEnd"/>
       <w:r>
         <w:rPr>
           <w:lang w:eastAsia="zh-CN"/>
@@ -8118,7 +8222,21 @@
         <w:rPr>
           <w:lang w:eastAsia="zh-CN"/>
         </w:rPr>
-        <w:t>(asyncio)</w:t>
+        <w:t>(</w:t>
+      </w:r>
+      <w:proofErr w:type="spellStart"/>
+      <w:r>
+        <w:rPr>
+          <w:lang w:eastAsia="zh-CN"/>
+        </w:rPr>
+        <w:t>asyncio</w:t>
+      </w:r>
+      <w:proofErr w:type="spellEnd"/>
+      <w:r>
+        <w:rPr>
+          <w:lang w:eastAsia="zh-CN"/>
+        </w:rPr>
+        <w:t>)</w:t>
       </w:r>
       <w:r>
         <w:rPr>
@@ -8150,12 +8268,14 @@
         </w:rPr>
         <w:t>的</w:t>
       </w:r>
+      <w:proofErr w:type="spellStart"/>
       <w:r>
         <w:rPr>
           <w:lang w:eastAsia="zh-CN"/>
         </w:rPr>
         <w:t>dataclass</w:t>
       </w:r>
+      <w:proofErr w:type="spellEnd"/>
       <w:r>
         <w:rPr>
           <w:lang w:eastAsia="zh-CN"/>
@@ -8195,11 +8315,19 @@
         </w:rPr>
         <w:t>框架采用</w:t>
       </w:r>
-      <w:r>
-        <w:rPr>
-          <w:lang w:eastAsia="zh-CN"/>
-        </w:rPr>
-        <w:t>FastAPI 0.100.0</w:t>
+      <w:proofErr w:type="spellStart"/>
+      <w:r>
+        <w:rPr>
+          <w:lang w:eastAsia="zh-CN"/>
+        </w:rPr>
+        <w:t>FastAPI</w:t>
+      </w:r>
+      <w:proofErr w:type="spellEnd"/>
+      <w:r>
+        <w:rPr>
+          <w:lang w:eastAsia="zh-CN"/>
+        </w:rPr>
+        <w:t xml:space="preserve"> 0.100.0</w:t>
       </w:r>
       <w:r>
         <w:rPr>
@@ -8231,36 +8359,42 @@
         </w:rPr>
         <w:t>实时通信。</w:t>
       </w:r>
+      <w:proofErr w:type="spellStart"/>
       <w:r>
         <w:rPr>
           <w:lang w:eastAsia="zh-CN"/>
         </w:rPr>
         <w:t>FastAPI</w:t>
       </w:r>
+      <w:proofErr w:type="spellEnd"/>
       <w:r>
         <w:rPr>
           <w:lang w:eastAsia="zh-CN"/>
         </w:rPr>
         <w:t>基于</w:t>
       </w:r>
+      <w:proofErr w:type="spellStart"/>
       <w:r>
         <w:rPr>
           <w:lang w:eastAsia="zh-CN"/>
         </w:rPr>
         <w:t>Pydantic</w:t>
       </w:r>
+      <w:proofErr w:type="spellEnd"/>
       <w:r>
         <w:rPr>
           <w:lang w:eastAsia="zh-CN"/>
         </w:rPr>
         <w:t>进行数据校验，支持异步请求处理，自动生成</w:t>
       </w:r>
+      <w:proofErr w:type="spellStart"/>
       <w:r>
         <w:rPr>
           <w:lang w:eastAsia="zh-CN"/>
         </w:rPr>
         <w:t>OpenAPI</w:t>
       </w:r>
+      <w:proofErr w:type="spellEnd"/>
       <w:r>
         <w:rPr>
           <w:lang w:eastAsia="zh-CN"/>
@@ -8279,12 +8413,14 @@
         </w:rPr>
         <w:t>服务器采用</w:t>
       </w:r>
+      <w:proofErr w:type="spellStart"/>
       <w:r>
         <w:rPr>
           <w:lang w:eastAsia="zh-CN"/>
         </w:rPr>
         <w:t>uvicorn</w:t>
       </w:r>
+      <w:proofErr w:type="spellEnd"/>
       <w:r>
         <w:rPr>
           <w:lang w:eastAsia="zh-CN"/>
@@ -8330,11 +8466,19 @@
         </w:rPr>
         <w:t>库实现富文本渲染，包括表格、面板、进度条、语法高亮等。交互式输入采用</w:t>
       </w:r>
-      <w:r>
-        <w:rPr>
-          <w:lang w:eastAsia="zh-CN"/>
-        </w:rPr>
-        <w:t>prompt_toolkit 3.0</w:t>
+      <w:proofErr w:type="spellStart"/>
+      <w:r>
+        <w:rPr>
+          <w:lang w:eastAsia="zh-CN"/>
+        </w:rPr>
+        <w:t>prompt_toolkit</w:t>
+      </w:r>
+      <w:proofErr w:type="spellEnd"/>
+      <w:r>
+        <w:rPr>
+          <w:lang w:eastAsia="zh-CN"/>
+        </w:rPr>
+        <w:t xml:space="preserve"> 3.0</w:t>
       </w:r>
       <w:r>
         <w:rPr>
@@ -8376,11 +8520,19 @@
         </w:rPr>
         <w:t>调用采用</w:t>
       </w:r>
-      <w:r>
-        <w:rPr>
-          <w:lang w:eastAsia="zh-CN"/>
-        </w:rPr>
-        <w:t>LiteLLM 1.0</w:t>
+      <w:proofErr w:type="spellStart"/>
+      <w:r>
+        <w:rPr>
+          <w:lang w:eastAsia="zh-CN"/>
+        </w:rPr>
+        <w:t>LiteLLM</w:t>
+      </w:r>
+      <w:proofErr w:type="spellEnd"/>
+      <w:r>
+        <w:rPr>
+          <w:lang w:eastAsia="zh-CN"/>
+        </w:rPr>
+        <w:t xml:space="preserve"> 1.0</w:t>
       </w:r>
       <w:r>
         <w:rPr>
@@ -8424,24 +8576,28 @@
         </w:rPr>
         <w:t>、</w:t>
       </w:r>
+      <w:proofErr w:type="spellStart"/>
       <w:r>
         <w:rPr>
           <w:lang w:eastAsia="zh-CN"/>
         </w:rPr>
         <w:t>Ollama</w:t>
       </w:r>
+      <w:proofErr w:type="spellEnd"/>
       <w:r>
         <w:rPr>
           <w:lang w:eastAsia="zh-CN"/>
         </w:rPr>
         <w:t>等多个模型提供商的接口。</w:t>
       </w:r>
+      <w:proofErr w:type="spellStart"/>
       <w:r>
         <w:rPr>
           <w:lang w:eastAsia="zh-CN"/>
         </w:rPr>
         <w:t>LiteLLM</w:t>
       </w:r>
+      <w:proofErr w:type="spellEnd"/>
       <w:r>
         <w:rPr>
           <w:lang w:eastAsia="zh-CN"/>
@@ -8487,12 +8643,14 @@
         </w:rPr>
         <w:t>，通过</w:t>
       </w:r>
+      <w:proofErr w:type="spellStart"/>
       <w:r>
         <w:rPr>
           <w:lang w:eastAsia="zh-CN"/>
         </w:rPr>
         <w:t>aiosqlite</w:t>
       </w:r>
+      <w:proofErr w:type="spellEnd"/>
       <w:r>
         <w:rPr>
           <w:lang w:eastAsia="zh-CN"/>
@@ -8736,11 +8894,19 @@
         </w:rPr>
         <w:t>、</w:t>
       </w:r>
-      <w:r>
-        <w:rPr>
-          <w:lang w:eastAsia="zh-CN"/>
-        </w:rPr>
-        <w:t>system_prompt(</w:t>
+      <w:proofErr w:type="spellStart"/>
+      <w:r>
+        <w:rPr>
+          <w:lang w:eastAsia="zh-CN"/>
+        </w:rPr>
+        <w:t>system_prompt</w:t>
+      </w:r>
+      <w:proofErr w:type="spellEnd"/>
+      <w:r>
+        <w:rPr>
+          <w:lang w:eastAsia="zh-CN"/>
+        </w:rPr>
+        <w:t>(</w:t>
       </w:r>
       <w:r>
         <w:rPr>
@@ -8788,7 +8954,21 @@
         <w:rPr>
           <w:lang w:eastAsia="zh-CN"/>
         </w:rPr>
-        <w:t>model default/fallback/temperature/max_tokens(</w:t>
+        <w:t>model default/fallback/temperature/</w:t>
+      </w:r>
+      <w:proofErr w:type="spellStart"/>
+      <w:r>
+        <w:rPr>
+          <w:lang w:eastAsia="zh-CN"/>
+        </w:rPr>
+        <w:t>max_tokens</w:t>
+      </w:r>
+      <w:proofErr w:type="spellEnd"/>
+      <w:r>
+        <w:rPr>
+          <w:lang w:eastAsia="zh-CN"/>
+        </w:rPr>
+        <w:t>(</w:t>
       </w:r>
       <w:r>
         <w:rPr>
@@ -8808,18 +8988,45 @@
         </w:rPr>
         <w:t>、</w:t>
       </w:r>
-      <w:r>
-        <w:rPr>
-          <w:lang w:eastAsia="zh-CN"/>
-        </w:rPr>
-        <w:t xml:space="preserve">mcp server_name { tools: [...] </w:t>
-      </w:r>
-      <w:r>
-        <w:t>}(MCP</w:t>
+      <w:proofErr w:type="spellStart"/>
+      <w:r>
+        <w:rPr>
+          <w:lang w:eastAsia="zh-CN"/>
+        </w:rPr>
+        <w:t>mcp</w:t>
+      </w:r>
+      <w:proofErr w:type="spellEnd"/>
+      <w:r>
+        <w:rPr>
+          <w:lang w:eastAsia="zh-CN"/>
+        </w:rPr>
+        <w:t xml:space="preserve"> </w:t>
+      </w:r>
+      <w:proofErr w:type="spellStart"/>
+      <w:r>
+        <w:rPr>
+          <w:lang w:eastAsia="zh-CN"/>
+        </w:rPr>
+        <w:t>server_name</w:t>
+      </w:r>
+      <w:proofErr w:type="spellEnd"/>
+      <w:r>
+        <w:rPr>
+          <w:lang w:eastAsia="zh-CN"/>
+        </w:rPr>
+        <w:t xml:space="preserve"> { tools: [...] </w:t>
+      </w:r>
+      <w:r>
+        <w:t>}(</w:t>
+      </w:r>
+      <w:proofErr w:type="spellStart"/>
+      <w:r>
+        <w:t>MCP</w:t>
       </w:r>
       <w:r>
         <w:t>工具配置</w:t>
       </w:r>
+      <w:proofErr w:type="spellEnd"/>
       <w:r>
         <w:t>)</w:t>
       </w:r>
@@ -8829,9 +9036,11 @@
       <w:r>
         <w:t>permission allow/deny/ask(</w:t>
       </w:r>
+      <w:proofErr w:type="spellStart"/>
       <w:r>
         <w:t>工具权限声明</w:t>
       </w:r>
+      <w:proofErr w:type="spellEnd"/>
       <w:r>
         <w:t>)</w:t>
       </w:r>
@@ -8868,27 +9077,62 @@
       <w:r>
         <w:t>(agent name { model: ..., prompt: ... })</w:t>
       </w:r>
+      <w:proofErr w:type="spellStart"/>
       <w:r>
         <w:t>和组件引用</w:t>
       </w:r>
-      <w:r>
-        <w:t>(agent name use component_name { model temperature: 0.5 })</w:t>
-      </w:r>
-      <w:r>
-        <w:t>。连接关系使用</w:t>
-      </w:r>
+      <w:proofErr w:type="spellEnd"/>
+      <w:r>
+        <w:t xml:space="preserve">(agent name use </w:t>
+      </w:r>
+      <w:proofErr w:type="spellStart"/>
+      <w:r>
+        <w:t>component_name</w:t>
+      </w:r>
+      <w:proofErr w:type="spellEnd"/>
+      <w:r>
+        <w:t xml:space="preserve"> { model temperature: 0.5 })</w:t>
+      </w:r>
+      <w:r>
+        <w:t>。</w:t>
+      </w:r>
+      <w:proofErr w:type="spellStart"/>
+      <w:r>
+        <w:t>连接关系使用</w:t>
+      </w:r>
+      <w:proofErr w:type="spellEnd"/>
       <w:r>
         <w:t>-&gt;</w:t>
       </w:r>
+      <w:proofErr w:type="spellStart"/>
       <w:r>
         <w:t>符号声明，支持端口级精确连接</w:t>
       </w:r>
-      <w:r>
-        <w:t>(A.port -&gt; B.port)</w:t>
-      </w:r>
+      <w:proofErr w:type="spellEnd"/>
+      <w:r>
+        <w:t>(</w:t>
+      </w:r>
+      <w:proofErr w:type="spellStart"/>
+      <w:r>
+        <w:t>A.port</w:t>
+      </w:r>
+      <w:proofErr w:type="spellEnd"/>
+      <w:r>
+        <w:t xml:space="preserve"> -&gt; </w:t>
+      </w:r>
+      <w:proofErr w:type="spellStart"/>
+      <w:r>
+        <w:t>B.port</w:t>
+      </w:r>
+      <w:proofErr w:type="spellEnd"/>
+      <w:r>
+        <w:t>)</w:t>
+      </w:r>
+      <w:proofErr w:type="spellStart"/>
       <w:r>
         <w:t>和自动推断</w:t>
       </w:r>
+      <w:proofErr w:type="spellEnd"/>
       <w:r>
         <w:t>(A -&gt; B)</w:t>
       </w:r>
@@ -8904,12 +9148,15 @@
           <w:lang w:eastAsia="zh-CN"/>
         </w:rPr>
       </w:pPr>
+      <w:proofErr w:type="spellStart"/>
       <w:r>
         <w:t>连接语法支持五种模式。顺序执行</w:t>
       </w:r>
+      <w:proofErr w:type="spellEnd"/>
       <w:r>
         <w:t>(A -&gt; B)</w:t>
       </w:r>
+      <w:proofErr w:type="spellStart"/>
       <w:r>
         <w:t>表示</w:t>
       </w:r>
@@ -8922,6 +9169,7 @@
       <w:r>
         <w:t>B</w:t>
       </w:r>
+      <w:proofErr w:type="spellEnd"/>
       <w:r>
         <w:t>。</w:t>
       </w:r>
@@ -9132,9 +9380,11 @@
       <w:r>
         <w:t>description: "</w:t>
       </w:r>
+      <w:proofErr w:type="spellStart"/>
       <w:r>
         <w:t>代码文件读取器</w:t>
       </w:r>
+      <w:proofErr w:type="spellEnd"/>
       <w:r>
         <w:t>"</w:t>
       </w:r>
@@ -9145,11 +9395,21 @@
         <w:ind w:firstLine="480"/>
       </w:pPr>
       <w:r>
-        <w:t xml:space="preserve">  system_prompt: "</w:t>
-      </w:r>
+        <w:t xml:space="preserve">  </w:t>
+      </w:r>
+      <w:proofErr w:type="spellStart"/>
+      <w:r>
+        <w:t>system_prompt</w:t>
+      </w:r>
+      <w:proofErr w:type="spellEnd"/>
+      <w:r>
+        <w:t>: "</w:t>
+      </w:r>
+      <w:proofErr w:type="spellStart"/>
       <w:r>
         <w:t>读取指定路径的代码文件内容</w:t>
       </w:r>
+      <w:proofErr w:type="spellEnd"/>
       <w:r>
         <w:t>"</w:t>
       </w:r>
@@ -9160,11 +9420,21 @@
         <w:ind w:firstLine="480"/>
       </w:pPr>
       <w:r>
-        <w:t xml:space="preserve">  port output code_content: string "</w:t>
-      </w:r>
+        <w:t xml:space="preserve">  port output </w:t>
+      </w:r>
+      <w:proofErr w:type="spellStart"/>
+      <w:r>
+        <w:t>code_content</w:t>
+      </w:r>
+      <w:proofErr w:type="spellEnd"/>
+      <w:r>
+        <w:t>: string "</w:t>
+      </w:r>
+      <w:proofErr w:type="spellStart"/>
       <w:r>
         <w:t>代码内容</w:t>
       </w:r>
+      <w:proofErr w:type="spellEnd"/>
       <w:r>
         <w:t>"</w:t>
       </w:r>
@@ -9237,9 +9507,11 @@
       <w:r>
         <w:t xml:space="preserve">  description: "</w:t>
       </w:r>
+      <w:proofErr w:type="spellStart"/>
       <w:r>
         <w:t>代码复杂度分析专家</w:t>
       </w:r>
+      <w:proofErr w:type="spellEnd"/>
       <w:r>
         <w:t>"</w:t>
       </w:r>
@@ -9250,11 +9522,21 @@
         <w:ind w:firstLine="480"/>
       </w:pPr>
       <w:r>
-        <w:t xml:space="preserve">  system_prompt: "</w:t>
-      </w:r>
+        <w:t xml:space="preserve">  </w:t>
+      </w:r>
+      <w:proofErr w:type="spellStart"/>
+      <w:r>
+        <w:t>system_prompt</w:t>
+      </w:r>
+      <w:proofErr w:type="spellEnd"/>
+      <w:r>
+        <w:t>: "</w:t>
+      </w:r>
+      <w:proofErr w:type="spellStart"/>
       <w:r>
         <w:t>分析代码的圈复杂度和认知复杂度</w:t>
       </w:r>
+      <w:proofErr w:type="spellEnd"/>
       <w:r>
         <w:t>"</w:t>
       </w:r>
@@ -9265,11 +9547,21 @@
         <w:ind w:firstLine="480"/>
       </w:pPr>
       <w:r>
-        <w:t xml:space="preserve">  port input code_content: string "</w:t>
-      </w:r>
+        <w:t xml:space="preserve">  port input </w:t>
+      </w:r>
+      <w:proofErr w:type="spellStart"/>
+      <w:r>
+        <w:t>code_content</w:t>
+      </w:r>
+      <w:proofErr w:type="spellEnd"/>
+      <w:r>
+        <w:t>: string "</w:t>
+      </w:r>
+      <w:proofErr w:type="spellStart"/>
       <w:r>
         <w:t>待分析的代码</w:t>
       </w:r>
+      <w:proofErr w:type="spellEnd"/>
       <w:r>
         <w:t>"</w:t>
       </w:r>
@@ -9282,9 +9574,11 @@
       <w:r>
         <w:t xml:space="preserve">  port output analysis: object "</w:t>
       </w:r>
+      <w:proofErr w:type="spellStart"/>
       <w:r>
         <w:t>复杂度分析结果</w:t>
       </w:r>
+      <w:proofErr w:type="spellEnd"/>
       <w:r>
         <w:t>"</w:t>
       </w:r>
@@ -9327,7 +9621,15 @@
         <w:ind w:firstLine="480"/>
       </w:pPr>
       <w:r>
-        <w:t>workflow code_review {</w:t>
+        <w:t xml:space="preserve">workflow </w:t>
+      </w:r>
+      <w:proofErr w:type="spellStart"/>
+      <w:r>
+        <w:t>code_review</w:t>
+      </w:r>
+      <w:proofErr w:type="spellEnd"/>
+      <w:r>
+        <w:t xml:space="preserve"> {</w:t>
       </w:r>
     </w:p>
     <w:p>
@@ -9395,8 +9697,21 @@
         <w:ind w:firstLine="480"/>
       </w:pPr>
       <w:r>
-        <w:t xml:space="preserve">  reader.code_content -&gt; complexity.code_content</w:t>
-      </w:r>
+        <w:t xml:space="preserve">  </w:t>
+      </w:r>
+      <w:proofErr w:type="spellStart"/>
+      <w:r>
+        <w:t>reader.code_content</w:t>
+      </w:r>
+      <w:proofErr w:type="spellEnd"/>
+      <w:r>
+        <w:t xml:space="preserve"> -&gt; </w:t>
+      </w:r>
+      <w:proofErr w:type="spellStart"/>
+      <w:r>
+        <w:t>complexity.code_content</w:t>
+      </w:r>
+      <w:proofErr w:type="spellEnd"/>
     </w:p>
     <w:p>
       <w:pPr>
@@ -9404,8 +9719,21 @@
         <w:ind w:firstLine="480"/>
       </w:pPr>
       <w:r>
-        <w:t xml:space="preserve">  reader.code_content -&gt; security.code_content</w:t>
-      </w:r>
+        <w:t xml:space="preserve">  </w:t>
+      </w:r>
+      <w:proofErr w:type="spellStart"/>
+      <w:r>
+        <w:t>reader.code_content</w:t>
+      </w:r>
+      <w:proofErr w:type="spellEnd"/>
+      <w:r>
+        <w:t xml:space="preserve"> -&gt; </w:t>
+      </w:r>
+      <w:proofErr w:type="spellStart"/>
+      <w:r>
+        <w:t>security.code_content</w:t>
+      </w:r>
+      <w:proofErr w:type="spellEnd"/>
     </w:p>
     <w:p>
       <w:pPr>
@@ -9413,8 +9741,21 @@
         <w:ind w:firstLine="480"/>
       </w:pPr>
       <w:r>
-        <w:t xml:space="preserve">  reader.code_content -&gt; style.code_content</w:t>
-      </w:r>
+        <w:t xml:space="preserve">  </w:t>
+      </w:r>
+      <w:proofErr w:type="spellStart"/>
+      <w:r>
+        <w:t>reader.code_content</w:t>
+      </w:r>
+      <w:proofErr w:type="spellEnd"/>
+      <w:r>
+        <w:t xml:space="preserve"> -&gt; </w:t>
+      </w:r>
+      <w:proofErr w:type="spellStart"/>
+      <w:r>
+        <w:t>style.code_content</w:t>
+      </w:r>
+      <w:proofErr w:type="spellEnd"/>
     </w:p>
     <w:p>
       <w:pPr>
@@ -9422,7 +9763,31 @@
         <w:ind w:firstLine="480"/>
       </w:pPr>
       <w:r>
-        <w:t xml:space="preserve">  (complexity.analysis, security.scan_result, style.check_result) -&gt; reviewer</w:t>
+        <w:t xml:space="preserve">  (</w:t>
+      </w:r>
+      <w:proofErr w:type="spellStart"/>
+      <w:r>
+        <w:t>complexity.analysis</w:t>
+      </w:r>
+      <w:proofErr w:type="spellEnd"/>
+      <w:r>
+        <w:t xml:space="preserve">, </w:t>
+      </w:r>
+      <w:proofErr w:type="spellStart"/>
+      <w:r>
+        <w:t>security.scan_result</w:t>
+      </w:r>
+      <w:proofErr w:type="spellEnd"/>
+      <w:r>
+        <w:t xml:space="preserve">, </w:t>
+      </w:r>
+      <w:proofErr w:type="spellStart"/>
+      <w:r>
+        <w:t>style.check_result</w:t>
+      </w:r>
+      <w:proofErr w:type="spellEnd"/>
+      <w:r>
+        <w:t>) -&gt; reviewer</w:t>
       </w:r>
     </w:p>
     <w:p>
@@ -9431,7 +9796,15 @@
         <w:ind w:firstLine="480"/>
       </w:pPr>
       <w:r>
-        <w:t xml:space="preserve">  reviewer.review_result -&gt; reporter</w:t>
+        <w:t xml:space="preserve">  </w:t>
+      </w:r>
+      <w:proofErr w:type="spellStart"/>
+      <w:r>
+        <w:t>reviewer.review_result</w:t>
+      </w:r>
+      <w:proofErr w:type="spellEnd"/>
+      <w:r>
+        <w:t xml:space="preserve"> -&gt; reporter</w:t>
       </w:r>
     </w:p>
     <w:p>
@@ -9450,13 +9823,18 @@
       <w:bookmarkStart w:id="39" w:name="_Toc233630909"/>
       <w:bookmarkStart w:id="40" w:name="_Toc233639362"/>
       <w:r>
-        <w:t>3.2.2 DAG</w:t>
+        <w:t xml:space="preserve">3.2.2 </w:t>
+      </w:r>
+      <w:proofErr w:type="spellStart"/>
+      <w:r>
+        <w:t>DAG</w:t>
       </w:r>
       <w:r>
         <w:t>引擎设计</w:t>
       </w:r>
       <w:bookmarkEnd w:id="39"/>
       <w:bookmarkEnd w:id="40"/>
+      <w:proofErr w:type="spellEnd"/>
     </w:p>
     <w:p>
       <w:pPr>
@@ -9496,12 +9874,14 @@
         </w:rPr>
         <w:t>当发现某个节点的邻居在当前递归路径中重复出现时，判定存在环，立即抛出</w:t>
       </w:r>
+      <w:proofErr w:type="spellStart"/>
       <w:r>
         <w:rPr>
           <w:lang w:eastAsia="zh-CN"/>
         </w:rPr>
         <w:t>DAGError</w:t>
       </w:r>
+      <w:proofErr w:type="spellEnd"/>
       <w:r>
         <w:rPr>
           <w:lang w:eastAsia="zh-CN"/>
@@ -9517,6 +9897,7 @@
           <w:lang w:eastAsia="zh-CN"/>
         </w:rPr>
       </w:pPr>
+      <w:proofErr w:type="spellStart"/>
       <w:r>
         <w:t>拓扑排序采用</w:t>
       </w:r>
@@ -9526,12 +9907,18 @@
       <w:r>
         <w:t>算法</w:t>
       </w:r>
-      <w:r>
-        <w:t>(BFS</w:t>
+      <w:proofErr w:type="spellEnd"/>
+      <w:r>
+        <w:t>(</w:t>
+      </w:r>
+      <w:proofErr w:type="spellStart"/>
+      <w:r>
+        <w:t>BFS</w:t>
       </w:r>
       <w:r>
         <w:t>方式</w:t>
       </w:r>
+      <w:proofErr w:type="spellEnd"/>
       <w:r>
         <w:t>)</w:t>
       </w:r>
@@ -9544,12 +9931,14 @@
         </w:rPr>
         <w:t>算法首先计算所有节点的入度，将入度为零的节点加入队列。然后迭代地从队列中取出节点，将其后继节点的入度减一，当后继节点入度变为零时加入队列。如果最终排序结果的节点数不等于图中总节点数，说明存在环，抛出</w:t>
       </w:r>
+      <w:proofErr w:type="spellStart"/>
       <w:r>
         <w:rPr>
           <w:lang w:eastAsia="zh-CN"/>
         </w:rPr>
         <w:t>DAGError</w:t>
       </w:r>
+      <w:proofErr w:type="spellEnd"/>
       <w:r>
         <w:rPr>
           <w:lang w:eastAsia="zh-CN"/>
@@ -9793,12 +10182,14 @@
         </w:rPr>
         <w:t>引擎生成的并行分组依次执行。组间采用顺序执行策略，确保依赖约束不被违反。组内采用</w:t>
       </w:r>
+      <w:proofErr w:type="spellStart"/>
       <w:r>
         <w:rPr>
           <w:lang w:eastAsia="zh-CN"/>
         </w:rPr>
         <w:t>asyncio.gather</w:t>
       </w:r>
+      <w:proofErr w:type="spellEnd"/>
       <w:r>
         <w:rPr>
           <w:lang w:eastAsia="zh-CN"/>
@@ -9817,12 +10208,14 @@
         </w:rPr>
         <w:t>作为</w:t>
       </w:r>
+      <w:proofErr w:type="spellStart"/>
       <w:r>
         <w:rPr>
           <w:lang w:eastAsia="zh-CN"/>
         </w:rPr>
         <w:t>asyncio.Task</w:t>
       </w:r>
+      <w:proofErr w:type="spellEnd"/>
       <w:r>
         <w:rPr>
           <w:lang w:eastAsia="zh-CN"/>
@@ -10154,12 +10547,14 @@
         </w:rPr>
         <w:t>策略在失败后重新执行，配合</w:t>
       </w:r>
+      <w:proofErr w:type="spellStart"/>
       <w:r>
         <w:rPr>
           <w:lang w:eastAsia="zh-CN"/>
         </w:rPr>
         <w:t>retry_count</w:t>
       </w:r>
+      <w:proofErr w:type="spellEnd"/>
       <w:r>
         <w:rPr>
           <w:lang w:eastAsia="zh-CN"/>
@@ -10490,12 +10885,14 @@
         </w:rPr>
         <w:t>的响应包含</w:t>
       </w:r>
+      <w:proofErr w:type="spellStart"/>
       <w:r>
         <w:rPr>
           <w:lang w:eastAsia="zh-CN"/>
         </w:rPr>
         <w:t>tool_calls</w:t>
       </w:r>
+      <w:proofErr w:type="spellEnd"/>
       <w:r>
         <w:rPr>
           <w:lang w:eastAsia="zh-CN"/>
@@ -10526,24 +10923,28 @@
         </w:rPr>
         <w:t>和</w:t>
       </w:r>
+      <w:proofErr w:type="spellStart"/>
       <w:r>
         <w:rPr>
           <w:lang w:eastAsia="zh-CN"/>
         </w:rPr>
         <w:t>function.arguments</w:t>
       </w:r>
+      <w:proofErr w:type="spellEnd"/>
       <w:r>
         <w:rPr>
           <w:lang w:eastAsia="zh-CN"/>
         </w:rPr>
         <w:t>，通过</w:t>
       </w:r>
+      <w:proofErr w:type="spellStart"/>
       <w:r>
         <w:rPr>
           <w:lang w:eastAsia="zh-CN"/>
         </w:rPr>
         <w:t>ToolRegistry</w:t>
       </w:r>
+      <w:proofErr w:type="spellEnd"/>
       <w:r>
         <w:rPr>
           <w:lang w:eastAsia="zh-CN"/>
@@ -10673,12 +11074,14 @@
         </w:rPr>
         <w:t>实例化时，系统调用</w:t>
       </w:r>
+      <w:proofErr w:type="spellStart"/>
       <w:r>
         <w:rPr>
           <w:lang w:eastAsia="zh-CN"/>
         </w:rPr>
         <w:t>create_filtered_registry</w:t>
       </w:r>
+      <w:proofErr w:type="spellEnd"/>
       <w:r>
         <w:rPr>
           <w:lang w:eastAsia="zh-CN"/>
@@ -11127,11 +11530,19 @@
         </w:rPr>
         <w:t>服务器名称中进行模糊搜索。</w:t>
       </w:r>
-      <w:r>
-        <w:rPr>
-          <w:lang w:eastAsia="zh-CN"/>
-        </w:rPr>
-        <w:t>filter_by_source()</w:t>
+      <w:proofErr w:type="spellStart"/>
+      <w:r>
+        <w:rPr>
+          <w:lang w:eastAsia="zh-CN"/>
+        </w:rPr>
+        <w:t>filter_by_source</w:t>
+      </w:r>
+      <w:proofErr w:type="spellEnd"/>
+      <w:r>
+        <w:rPr>
+          <w:lang w:eastAsia="zh-CN"/>
+        </w:rPr>
+        <w:t>()</w:t>
       </w:r>
       <w:r>
         <w:rPr>
@@ -11139,11 +11550,19 @@
         </w:rPr>
         <w:t>、</w:t>
       </w:r>
-      <w:r>
-        <w:rPr>
-          <w:lang w:eastAsia="zh-CN"/>
-        </w:rPr>
-        <w:t>filter_by_model()</w:t>
+      <w:proofErr w:type="spellStart"/>
+      <w:r>
+        <w:rPr>
+          <w:lang w:eastAsia="zh-CN"/>
+        </w:rPr>
+        <w:t>filter_by_model</w:t>
+      </w:r>
+      <w:proofErr w:type="spellEnd"/>
+      <w:r>
+        <w:rPr>
+          <w:lang w:eastAsia="zh-CN"/>
+        </w:rPr>
+        <w:t>()</w:t>
       </w:r>
       <w:r>
         <w:rPr>
@@ -11151,11 +11570,19 @@
         </w:rPr>
         <w:t>、</w:t>
       </w:r>
-      <w:r>
-        <w:rPr>
-          <w:lang w:eastAsia="zh-CN"/>
-        </w:rPr>
-        <w:t>filter_by_mcp()</w:t>
+      <w:proofErr w:type="spellStart"/>
+      <w:r>
+        <w:rPr>
+          <w:lang w:eastAsia="zh-CN"/>
+        </w:rPr>
+        <w:t>filter_by_mcp</w:t>
+      </w:r>
+      <w:proofErr w:type="spellEnd"/>
+      <w:r>
+        <w:rPr>
+          <w:lang w:eastAsia="zh-CN"/>
+        </w:rPr>
+        <w:t>()</w:t>
       </w:r>
       <w:r>
         <w:rPr>
@@ -11175,11 +11602,19 @@
         </w:rPr>
         <w:t>服务器过滤组件。</w:t>
       </w:r>
-      <w:r>
-        <w:rPr>
-          <w:lang w:eastAsia="zh-CN"/>
-        </w:rPr>
-        <w:t>export_component()</w:t>
+      <w:proofErr w:type="spellStart"/>
+      <w:r>
+        <w:rPr>
+          <w:lang w:eastAsia="zh-CN"/>
+        </w:rPr>
+        <w:t>export_component</w:t>
+      </w:r>
+      <w:proofErr w:type="spellEnd"/>
+      <w:r>
+        <w:rPr>
+          <w:lang w:eastAsia="zh-CN"/>
+        </w:rPr>
+        <w:t>()</w:t>
       </w:r>
       <w:r>
         <w:rPr>
@@ -11406,12 +11841,14 @@
         </w:rPr>
         <w:t>句式，生成</w:t>
       </w:r>
+      <w:proofErr w:type="spellStart"/>
       <w:r>
         <w:rPr>
           <w:lang w:eastAsia="zh-CN"/>
         </w:rPr>
         <w:t>parallel_aggregate</w:t>
       </w:r>
+      <w:proofErr w:type="spellEnd"/>
       <w:r>
         <w:rPr>
           <w:lang w:eastAsia="zh-CN"/>
@@ -11644,8 +12081,16 @@
         <w:rPr>
           <w:lang w:eastAsia="zh-CN"/>
         </w:rPr>
-        <w:t>Python dataclass</w:t>
-      </w:r>
+        <w:t xml:space="preserve">Python </w:t>
+      </w:r>
+      <w:proofErr w:type="spellStart"/>
+      <w:r>
+        <w:rPr>
+          <w:lang w:eastAsia="zh-CN"/>
+        </w:rPr>
+        <w:t>dataclass</w:t>
+      </w:r>
+      <w:proofErr w:type="spellEnd"/>
       <w:r>
         <w:rPr>
           <w:lang w:eastAsia="zh-CN"/>
@@ -11764,7 +12209,21 @@
         <w:rPr>
           <w:lang w:eastAsia="zh-CN"/>
         </w:rPr>
-        <w:t>string/number/boolean/object/array)</w:t>
+        <w:t>string/number/</w:t>
+      </w:r>
+      <w:proofErr w:type="spellStart"/>
+      <w:r>
+        <w:rPr>
+          <w:lang w:eastAsia="zh-CN"/>
+        </w:rPr>
+        <w:t>boolean</w:t>
+      </w:r>
+      <w:proofErr w:type="spellEnd"/>
+      <w:r>
+        <w:rPr>
+          <w:lang w:eastAsia="zh-CN"/>
+        </w:rPr>
+        <w:t>/object/array)</w:t>
       </w:r>
       <w:r>
         <w:rPr>
@@ -11820,12 +12279,14 @@
         </w:rPr>
         <w:t>、</w:t>
       </w:r>
+      <w:proofErr w:type="spellStart"/>
       <w:r>
         <w:rPr>
           <w:lang w:eastAsia="zh-CN"/>
         </w:rPr>
         <w:t>system_prompt</w:t>
       </w:r>
+      <w:proofErr w:type="spellEnd"/>
       <w:r>
         <w:rPr>
           <w:lang w:eastAsia="zh-CN"/>
@@ -11844,12 +12305,14 @@
         </w:rPr>
         <w:t>、</w:t>
       </w:r>
+      <w:proofErr w:type="spellStart"/>
       <w:r>
         <w:rPr>
           <w:lang w:eastAsia="zh-CN"/>
         </w:rPr>
         <w:t>mcp</w:t>
       </w:r>
+      <w:proofErr w:type="spellEnd"/>
       <w:r>
         <w:rPr>
           <w:lang w:eastAsia="zh-CN"/>
@@ -11904,11 +12367,19 @@
         </w:rPr>
         <w:t>、</w:t>
       </w:r>
-      <w:r>
-        <w:rPr>
-          <w:lang w:eastAsia="zh-CN"/>
-        </w:rPr>
-        <w:t>on_fail(stop/skip/retry)</w:t>
+      <w:proofErr w:type="spellStart"/>
+      <w:r>
+        <w:rPr>
+          <w:lang w:eastAsia="zh-CN"/>
+        </w:rPr>
+        <w:t>on_fail</w:t>
+      </w:r>
+      <w:proofErr w:type="spellEnd"/>
+      <w:r>
+        <w:rPr>
+          <w:lang w:eastAsia="zh-CN"/>
+        </w:rPr>
+        <w:t>(stop/skip/retry)</w:t>
       </w:r>
       <w:r>
         <w:rPr>
@@ -11916,24 +12387,28 @@
         </w:rPr>
         <w:t>、</w:t>
       </w:r>
+      <w:proofErr w:type="spellStart"/>
       <w:r>
         <w:rPr>
           <w:lang w:eastAsia="zh-CN"/>
         </w:rPr>
         <w:t>retry_count</w:t>
       </w:r>
+      <w:proofErr w:type="spellEnd"/>
       <w:r>
         <w:rPr>
           <w:lang w:eastAsia="zh-CN"/>
         </w:rPr>
         <w:t>等字段。</w:t>
       </w:r>
+      <w:proofErr w:type="spellStart"/>
       <w:r>
         <w:rPr>
           <w:lang w:eastAsia="zh-CN"/>
         </w:rPr>
         <w:t>AgentInstance</w:t>
       </w:r>
+      <w:proofErr w:type="spellEnd"/>
       <w:r>
         <w:rPr>
           <w:lang w:eastAsia="zh-CN"/>
@@ -12024,60 +12499,70 @@
         </w:rPr>
         <w:t>类型表示连接关系，包含</w:t>
       </w:r>
+      <w:proofErr w:type="spellStart"/>
       <w:r>
         <w:rPr>
           <w:lang w:eastAsia="zh-CN"/>
         </w:rPr>
         <w:t>source_agent</w:t>
       </w:r>
+      <w:proofErr w:type="spellEnd"/>
       <w:r>
         <w:rPr>
           <w:lang w:eastAsia="zh-CN"/>
         </w:rPr>
         <w:t>、</w:t>
       </w:r>
+      <w:proofErr w:type="spellStart"/>
       <w:r>
         <w:rPr>
           <w:lang w:eastAsia="zh-CN"/>
         </w:rPr>
         <w:t>source_port</w:t>
       </w:r>
+      <w:proofErr w:type="spellEnd"/>
       <w:r>
         <w:rPr>
           <w:lang w:eastAsia="zh-CN"/>
         </w:rPr>
         <w:t>、</w:t>
       </w:r>
+      <w:proofErr w:type="spellStart"/>
       <w:r>
         <w:rPr>
           <w:lang w:eastAsia="zh-CN"/>
         </w:rPr>
         <w:t>target_agents</w:t>
       </w:r>
+      <w:proofErr w:type="spellEnd"/>
       <w:r>
         <w:rPr>
           <w:lang w:eastAsia="zh-CN"/>
         </w:rPr>
         <w:t>、</w:t>
       </w:r>
+      <w:proofErr w:type="spellStart"/>
       <w:r>
         <w:rPr>
           <w:lang w:eastAsia="zh-CN"/>
         </w:rPr>
         <w:t>target_ports</w:t>
       </w:r>
+      <w:proofErr w:type="spellEnd"/>
       <w:r>
         <w:rPr>
           <w:lang w:eastAsia="zh-CN"/>
         </w:rPr>
         <w:t>、</w:t>
       </w:r>
+      <w:proofErr w:type="spellStart"/>
       <w:r>
         <w:rPr>
           <w:lang w:eastAsia="zh-CN"/>
         </w:rPr>
         <w:t>routing_rules</w:t>
       </w:r>
+      <w:proofErr w:type="spellEnd"/>
       <w:r>
         <w:rPr>
           <w:lang w:eastAsia="zh-CN"/>
@@ -12144,12 +12629,14 @@
         </w:rPr>
         <w:t>、</w:t>
       </w:r>
+      <w:proofErr w:type="spellStart"/>
       <w:r>
         <w:rPr>
           <w:lang w:eastAsia="zh-CN"/>
         </w:rPr>
         <w:t>output_mappings</w:t>
       </w:r>
+      <w:proofErr w:type="spellEnd"/>
       <w:r>
         <w:rPr>
           <w:lang w:eastAsia="zh-CN"/>
@@ -12183,11 +12670,19 @@
         </w:rPr>
         <w:t>中，包含</w:t>
       </w:r>
-      <w:r>
-        <w:rPr>
-          <w:lang w:eastAsia="zh-CN"/>
-        </w:rPr>
-        <w:t>ExecutionRecord(</w:t>
+      <w:proofErr w:type="spellStart"/>
+      <w:r>
+        <w:rPr>
+          <w:lang w:eastAsia="zh-CN"/>
+        </w:rPr>
+        <w:t>ExecutionRecord</w:t>
+      </w:r>
+      <w:proofErr w:type="spellEnd"/>
+      <w:r>
+        <w:rPr>
+          <w:lang w:eastAsia="zh-CN"/>
+        </w:rPr>
+        <w:t>(</w:t>
       </w:r>
       <w:r>
         <w:rPr>
@@ -12207,11 +12702,19 @@
         </w:rPr>
         <w:t>和</w:t>
       </w:r>
-      <w:r>
-        <w:rPr>
-          <w:lang w:eastAsia="zh-CN"/>
-        </w:rPr>
-        <w:t>AgentExecution(Agent</w:t>
+      <w:proofErr w:type="spellStart"/>
+      <w:r>
+        <w:rPr>
+          <w:lang w:eastAsia="zh-CN"/>
+        </w:rPr>
+        <w:t>AgentExecution</w:t>
+      </w:r>
+      <w:proofErr w:type="spellEnd"/>
+      <w:r>
+        <w:rPr>
+          <w:lang w:eastAsia="zh-CN"/>
+        </w:rPr>
+        <w:t>(Agent</w:t>
       </w:r>
       <w:r>
         <w:rPr>
@@ -12231,48 +12734,56 @@
         </w:rPr>
         <w:t>等类型。</w:t>
       </w:r>
+      <w:proofErr w:type="spellStart"/>
       <w:r>
         <w:rPr>
           <w:lang w:eastAsia="zh-CN"/>
         </w:rPr>
         <w:t>ExecutionRecord</w:t>
       </w:r>
+      <w:proofErr w:type="spellEnd"/>
       <w:r>
         <w:rPr>
           <w:lang w:eastAsia="zh-CN"/>
         </w:rPr>
         <w:t>记录每次工作流执行的</w:t>
       </w:r>
+      <w:proofErr w:type="spellStart"/>
       <w:r>
         <w:rPr>
           <w:lang w:eastAsia="zh-CN"/>
         </w:rPr>
         <w:t>workflow_name</w:t>
       </w:r>
+      <w:proofErr w:type="spellEnd"/>
       <w:r>
         <w:rPr>
           <w:lang w:eastAsia="zh-CN"/>
         </w:rPr>
         <w:t>、</w:t>
       </w:r>
+      <w:proofErr w:type="spellStart"/>
       <w:r>
         <w:rPr>
           <w:lang w:eastAsia="zh-CN"/>
         </w:rPr>
         <w:t>start_time</w:t>
       </w:r>
+      <w:proofErr w:type="spellEnd"/>
       <w:r>
         <w:rPr>
           <w:lang w:eastAsia="zh-CN"/>
         </w:rPr>
         <w:t>、</w:t>
       </w:r>
+      <w:proofErr w:type="spellStart"/>
       <w:r>
         <w:rPr>
           <w:lang w:eastAsia="zh-CN"/>
         </w:rPr>
         <w:t>end_time</w:t>
       </w:r>
+      <w:proofErr w:type="spellEnd"/>
       <w:r>
         <w:rPr>
           <w:lang w:eastAsia="zh-CN"/>
@@ -12291,48 +12802,56 @@
         </w:rPr>
         <w:t>、</w:t>
       </w:r>
+      <w:proofErr w:type="spellStart"/>
       <w:r>
         <w:rPr>
           <w:lang w:eastAsia="zh-CN"/>
         </w:rPr>
         <w:t>total_agents</w:t>
       </w:r>
+      <w:proofErr w:type="spellEnd"/>
       <w:r>
         <w:rPr>
           <w:lang w:eastAsia="zh-CN"/>
         </w:rPr>
         <w:t>、</w:t>
       </w:r>
+      <w:proofErr w:type="spellStart"/>
       <w:r>
         <w:rPr>
           <w:lang w:eastAsia="zh-CN"/>
         </w:rPr>
         <w:t>completed_agents</w:t>
       </w:r>
+      <w:proofErr w:type="spellEnd"/>
       <w:r>
         <w:rPr>
           <w:lang w:eastAsia="zh-CN"/>
         </w:rPr>
         <w:t>、</w:t>
       </w:r>
+      <w:proofErr w:type="spellStart"/>
       <w:r>
         <w:rPr>
           <w:lang w:eastAsia="zh-CN"/>
         </w:rPr>
         <w:t>failed_agents</w:t>
       </w:r>
+      <w:proofErr w:type="spellEnd"/>
       <w:r>
         <w:rPr>
           <w:lang w:eastAsia="zh-CN"/>
         </w:rPr>
         <w:t>等信息。</w:t>
       </w:r>
+      <w:proofErr w:type="spellStart"/>
       <w:r>
         <w:rPr>
           <w:lang w:eastAsia="zh-CN"/>
         </w:rPr>
         <w:t>AgentExecution</w:t>
       </w:r>
+      <w:proofErr w:type="spellEnd"/>
       <w:r>
         <w:rPr>
           <w:lang w:eastAsia="zh-CN"/>
@@ -12351,48 +12870,56 @@
         </w:rPr>
         <w:t>的</w:t>
       </w:r>
+      <w:proofErr w:type="spellStart"/>
       <w:r>
         <w:rPr>
           <w:lang w:eastAsia="zh-CN"/>
         </w:rPr>
         <w:t>input_data</w:t>
       </w:r>
+      <w:proofErr w:type="spellEnd"/>
       <w:r>
         <w:rPr>
           <w:lang w:eastAsia="zh-CN"/>
         </w:rPr>
         <w:t>、</w:t>
       </w:r>
+      <w:proofErr w:type="spellStart"/>
       <w:r>
         <w:rPr>
           <w:lang w:eastAsia="zh-CN"/>
         </w:rPr>
         <w:t>output_data</w:t>
       </w:r>
+      <w:proofErr w:type="spellEnd"/>
       <w:r>
         <w:rPr>
           <w:lang w:eastAsia="zh-CN"/>
         </w:rPr>
         <w:t>、</w:t>
       </w:r>
+      <w:proofErr w:type="spellStart"/>
       <w:r>
         <w:rPr>
           <w:lang w:eastAsia="zh-CN"/>
         </w:rPr>
         <w:t>start_time</w:t>
       </w:r>
+      <w:proofErr w:type="spellEnd"/>
       <w:r>
         <w:rPr>
           <w:lang w:eastAsia="zh-CN"/>
         </w:rPr>
         <w:t>、</w:t>
       </w:r>
+      <w:proofErr w:type="spellStart"/>
       <w:r>
         <w:rPr>
           <w:lang w:eastAsia="zh-CN"/>
         </w:rPr>
         <w:t>end_time</w:t>
       </w:r>
+      <w:proofErr w:type="spellEnd"/>
       <w:r>
         <w:rPr>
           <w:lang w:eastAsia="zh-CN"/>
@@ -12411,12 +12938,14 @@
         </w:rPr>
         <w:t>、</w:t>
       </w:r>
+      <w:proofErr w:type="spellStart"/>
       <w:r>
         <w:rPr>
           <w:lang w:eastAsia="zh-CN"/>
         </w:rPr>
         <w:t>error_message</w:t>
       </w:r>
+      <w:proofErr w:type="spellEnd"/>
       <w:r>
         <w:rPr>
           <w:lang w:eastAsia="zh-CN"/>
@@ -12442,12 +12971,14 @@
         <w:lastRenderedPageBreak/>
         <w:t>据库持久化存储，通过</w:t>
       </w:r>
+      <w:proofErr w:type="spellStart"/>
       <w:r>
         <w:rPr>
           <w:lang w:eastAsia="zh-CN"/>
         </w:rPr>
         <w:t>aiosqlite</w:t>
       </w:r>
+      <w:proofErr w:type="spellEnd"/>
       <w:r>
         <w:rPr>
           <w:lang w:eastAsia="zh-CN"/>
@@ -12466,12 +12997,14 @@
         </w:rPr>
         <w:t>表和</w:t>
       </w:r>
+      <w:proofErr w:type="spellStart"/>
       <w:r>
         <w:rPr>
           <w:lang w:eastAsia="zh-CN"/>
         </w:rPr>
         <w:t>agent_executions</w:t>
       </w:r>
+      <w:proofErr w:type="spellEnd"/>
       <w:r>
         <w:rPr>
           <w:lang w:eastAsia="zh-CN"/>
@@ -12621,12 +13154,14 @@
         </w:rPr>
         <w:t>，虚拟环境为</w:t>
       </w:r>
+      <w:proofErr w:type="spellStart"/>
       <w:r>
         <w:rPr>
           <w:lang w:eastAsia="zh-CN"/>
         </w:rPr>
         <w:t>venv</w:t>
       </w:r>
+      <w:proofErr w:type="spellEnd"/>
       <w:r>
         <w:rPr>
           <w:lang w:eastAsia="zh-CN"/>
@@ -12645,11 +13180,19 @@
         </w:rPr>
         <w:t>框架为</w:t>
       </w:r>
-      <w:r>
-        <w:rPr>
-          <w:lang w:eastAsia="zh-CN"/>
-        </w:rPr>
-        <w:t>FastAPI 0.100.0</w:t>
+      <w:proofErr w:type="spellStart"/>
+      <w:r>
+        <w:rPr>
+          <w:lang w:eastAsia="zh-CN"/>
+        </w:rPr>
+        <w:t>FastAPI</w:t>
+      </w:r>
+      <w:proofErr w:type="spellEnd"/>
+      <w:r>
+        <w:rPr>
+          <w:lang w:eastAsia="zh-CN"/>
+        </w:rPr>
+        <w:t xml:space="preserve"> 0.100.0</w:t>
       </w:r>
       <w:r>
         <w:rPr>
@@ -12669,11 +13212,19 @@
         </w:rPr>
         <w:t>服务器为</w:t>
       </w:r>
-      <w:r>
-        <w:rPr>
-          <w:lang w:eastAsia="zh-CN"/>
-        </w:rPr>
-        <w:t>uvicorn 0.23.0</w:t>
+      <w:proofErr w:type="spellStart"/>
+      <w:r>
+        <w:rPr>
+          <w:lang w:eastAsia="zh-CN"/>
+        </w:rPr>
+        <w:t>uvicorn</w:t>
+      </w:r>
+      <w:proofErr w:type="spellEnd"/>
+      <w:r>
+        <w:rPr>
+          <w:lang w:eastAsia="zh-CN"/>
+        </w:rPr>
+        <w:t xml:space="preserve"> 0.23.0</w:t>
       </w:r>
       <w:r>
         <w:rPr>
@@ -12693,11 +13244,19 @@
         </w:rPr>
         <w:t>和</w:t>
       </w:r>
-      <w:r>
-        <w:rPr>
-          <w:lang w:eastAsia="zh-CN"/>
-        </w:rPr>
-        <w:t>prompt_toolkit 3.0</w:t>
+      <w:proofErr w:type="spellStart"/>
+      <w:r>
+        <w:rPr>
+          <w:lang w:eastAsia="zh-CN"/>
+        </w:rPr>
+        <w:t>prompt_toolkit</w:t>
+      </w:r>
+      <w:proofErr w:type="spellEnd"/>
+      <w:r>
+        <w:rPr>
+          <w:lang w:eastAsia="zh-CN"/>
+        </w:rPr>
+        <w:t xml:space="preserve"> 3.0</w:t>
       </w:r>
       <w:r>
         <w:rPr>
@@ -12717,11 +13276,19 @@
         </w:rPr>
         <w:t>调用库为</w:t>
       </w:r>
-      <w:r>
-        <w:rPr>
-          <w:lang w:eastAsia="zh-CN"/>
-        </w:rPr>
-        <w:t>LiteLLM 1.0</w:t>
+      <w:proofErr w:type="spellStart"/>
+      <w:r>
+        <w:rPr>
+          <w:lang w:eastAsia="zh-CN"/>
+        </w:rPr>
+        <w:t>LiteLLM</w:t>
+      </w:r>
+      <w:proofErr w:type="spellEnd"/>
+      <w:r>
+        <w:rPr>
+          <w:lang w:eastAsia="zh-CN"/>
+        </w:rPr>
+        <w:t xml:space="preserve"> 1.0</w:t>
       </w:r>
       <w:r>
         <w:rPr>
@@ -12777,11 +13344,19 @@
         </w:rPr>
         <w:t>，通过</w:t>
       </w:r>
-      <w:r>
-        <w:rPr>
-          <w:lang w:eastAsia="zh-CN"/>
-        </w:rPr>
-        <w:t>aiosqlite 0.19.0</w:t>
+      <w:proofErr w:type="spellStart"/>
+      <w:r>
+        <w:rPr>
+          <w:lang w:eastAsia="zh-CN"/>
+        </w:rPr>
+        <w:t>aiosqlite</w:t>
+      </w:r>
+      <w:proofErr w:type="spellEnd"/>
+      <w:r>
+        <w:rPr>
+          <w:lang w:eastAsia="zh-CN"/>
+        </w:rPr>
+        <w:t xml:space="preserve"> 0.19.0</w:t>
       </w:r>
       <w:r>
         <w:rPr>
@@ -12789,11 +13364,19 @@
         </w:rPr>
         <w:t>异步访问。测试框架为</w:t>
       </w:r>
-      <w:r>
-        <w:rPr>
-          <w:lang w:eastAsia="zh-CN"/>
-        </w:rPr>
-        <w:t>pytest 7.0</w:t>
+      <w:proofErr w:type="spellStart"/>
+      <w:r>
+        <w:rPr>
+          <w:lang w:eastAsia="zh-CN"/>
+        </w:rPr>
+        <w:t>pytest</w:t>
+      </w:r>
+      <w:proofErr w:type="spellEnd"/>
+      <w:r>
+        <w:rPr>
+          <w:lang w:eastAsia="zh-CN"/>
+        </w:rPr>
+        <w:t xml:space="preserve"> 7.0</w:t>
       </w:r>
       <w:r>
         <w:rPr>
@@ -12801,11 +13384,19 @@
         </w:rPr>
         <w:t>配合</w:t>
       </w:r>
-      <w:r>
-        <w:rPr>
-          <w:lang w:eastAsia="zh-CN"/>
-        </w:rPr>
-        <w:t>pytest-asyncio 0.21</w:t>
+      <w:proofErr w:type="spellStart"/>
+      <w:r>
+        <w:rPr>
+          <w:lang w:eastAsia="zh-CN"/>
+        </w:rPr>
+        <w:t>pytest-asyncio</w:t>
+      </w:r>
+      <w:proofErr w:type="spellEnd"/>
+      <w:r>
+        <w:rPr>
+          <w:lang w:eastAsia="zh-CN"/>
+        </w:rPr>
+        <w:t xml:space="preserve"> 0.21</w:t>
       </w:r>
       <w:r>
         <w:rPr>
@@ -13090,7 +13681,21 @@
         <w:rPr>
           <w:lang w:eastAsia="zh-CN"/>
         </w:rPr>
-        <w:t>(reverse_adj)</w:t>
+        <w:t>(</w:t>
+      </w:r>
+      <w:proofErr w:type="spellStart"/>
+      <w:r>
+        <w:rPr>
+          <w:lang w:eastAsia="zh-CN"/>
+        </w:rPr>
+        <w:t>reverse_adj</w:t>
+      </w:r>
+      <w:proofErr w:type="spellEnd"/>
+      <w:r>
+        <w:rPr>
+          <w:lang w:eastAsia="zh-CN"/>
+        </w:rPr>
+        <w:t>)</w:t>
       </w:r>
       <w:r>
         <w:rPr>
@@ -13102,8 +13707,16 @@
         <w:rPr>
           <w:lang w:eastAsia="zh-CN"/>
         </w:rPr>
-        <w:t>_has_cycle</w:t>
-      </w:r>
+        <w:t>_</w:t>
+      </w:r>
+      <w:proofErr w:type="spellStart"/>
+      <w:r>
+        <w:rPr>
+          <w:lang w:eastAsia="zh-CN"/>
+        </w:rPr>
+        <w:t>has_cycle</w:t>
+      </w:r>
+      <w:proofErr w:type="spellEnd"/>
       <w:r>
         <w:rPr>
           <w:lang w:eastAsia="zh-CN"/>
@@ -13129,8 +13742,16 @@
         <w:rPr>
           <w:lang w:eastAsia="zh-CN"/>
         </w:rPr>
-        <w:t>_has_cycle</w:t>
-      </w:r>
+        <w:t>_</w:t>
+      </w:r>
+      <w:proofErr w:type="spellStart"/>
+      <w:r>
+        <w:rPr>
+          <w:lang w:eastAsia="zh-CN"/>
+        </w:rPr>
+        <w:t>has_cycle</w:t>
+      </w:r>
+      <w:proofErr w:type="spellEnd"/>
       <w:r>
         <w:rPr>
           <w:lang w:eastAsia="zh-CN"/>
@@ -13161,12 +13782,14 @@
         </w:rPr>
         <w:t>集合和</w:t>
       </w:r>
+      <w:proofErr w:type="spellStart"/>
       <w:r>
         <w:rPr>
           <w:lang w:eastAsia="zh-CN"/>
         </w:rPr>
         <w:t>recursion_stack</w:t>
       </w:r>
+      <w:proofErr w:type="spellEnd"/>
       <w:r>
         <w:rPr>
           <w:lang w:eastAsia="zh-CN"/>
@@ -13177,8 +13800,16 @@
         <w:rPr>
           <w:lang w:eastAsia="zh-CN"/>
         </w:rPr>
-        <w:t>_dfs</w:t>
-      </w:r>
+        <w:t>_</w:t>
+      </w:r>
+      <w:proofErr w:type="spellStart"/>
+      <w:r>
+        <w:rPr>
+          <w:lang w:eastAsia="zh-CN"/>
+        </w:rPr>
+        <w:t>dfs</w:t>
+      </w:r>
+      <w:proofErr w:type="spellEnd"/>
       <w:r>
         <w:rPr>
           <w:lang w:eastAsia="zh-CN"/>
@@ -13197,24 +13828,28 @@
         </w:rPr>
         <w:t>和</w:t>
       </w:r>
+      <w:proofErr w:type="spellStart"/>
       <w:r>
         <w:rPr>
           <w:lang w:eastAsia="zh-CN"/>
         </w:rPr>
         <w:t>recursion_stack</w:t>
       </w:r>
+      <w:proofErr w:type="spellEnd"/>
       <w:r>
         <w:rPr>
           <w:lang w:eastAsia="zh-CN"/>
         </w:rPr>
         <w:t>，遍历其所有邻居节点：如果邻居在</w:t>
       </w:r>
+      <w:proofErr w:type="spellStart"/>
       <w:r>
         <w:rPr>
           <w:lang w:eastAsia="zh-CN"/>
         </w:rPr>
         <w:t>recursion_stack</w:t>
       </w:r>
+      <w:proofErr w:type="spellEnd"/>
       <w:r>
         <w:rPr>
           <w:lang w:eastAsia="zh-CN"/>
@@ -13237,20 +13872,30 @@
         <w:rPr>
           <w:lang w:eastAsia="zh-CN"/>
         </w:rPr>
-        <w:t>_dfs</w:t>
-      </w:r>
+        <w:t>_</w:t>
+      </w:r>
+      <w:proofErr w:type="spellStart"/>
+      <w:r>
+        <w:rPr>
+          <w:lang w:eastAsia="zh-CN"/>
+        </w:rPr>
+        <w:t>dfs</w:t>
+      </w:r>
+      <w:proofErr w:type="spellEnd"/>
       <w:r>
         <w:rPr>
           <w:lang w:eastAsia="zh-CN"/>
         </w:rPr>
         <w:t>。递归返回后将当前节点从</w:t>
       </w:r>
+      <w:proofErr w:type="spellStart"/>
       <w:r>
         <w:rPr>
           <w:lang w:eastAsia="zh-CN"/>
         </w:rPr>
         <w:t>recursion_stack</w:t>
       </w:r>
+      <w:proofErr w:type="spellEnd"/>
       <w:r>
         <w:rPr>
           <w:lang w:eastAsia="zh-CN"/>
@@ -13284,12 +13929,14 @@
         </w:rPr>
         <w:t>拓扑排序方法</w:t>
       </w:r>
+      <w:proofErr w:type="spellStart"/>
       <w:r>
         <w:rPr>
           <w:lang w:eastAsia="zh-CN"/>
         </w:rPr>
         <w:t>topological_sort</w:t>
       </w:r>
+      <w:proofErr w:type="spellEnd"/>
       <w:r>
         <w:rPr>
           <w:lang w:eastAsia="zh-CN"/>
@@ -13380,12 +14027,14 @@
         </w:rPr>
         <w:t>。循环结束后检查排序结果长度是否等于节点总数，不相等则抛出</w:t>
       </w:r>
+      <w:proofErr w:type="spellStart"/>
       <w:r>
         <w:rPr>
           <w:lang w:eastAsia="zh-CN"/>
         </w:rPr>
         <w:t>DAGError</w:t>
       </w:r>
+      <w:proofErr w:type="spellEnd"/>
       <w:r>
         <w:rPr>
           <w:lang w:eastAsia="zh-CN"/>
@@ -13468,11 +14117,13 @@
       <w:r>
         <w:t xml:space="preserve">4.2.2 </w:t>
       </w:r>
+      <w:proofErr w:type="spellStart"/>
       <w:r>
         <w:t>调度器实现</w:t>
       </w:r>
       <w:bookmarkEnd w:id="59"/>
       <w:bookmarkEnd w:id="60"/>
+      <w:proofErr w:type="spellEnd"/>
     </w:p>
     <w:p>
       <w:pPr>
@@ -13726,12 +14377,14 @@
         </w:rPr>
         <w:t>模式为每个元素</w:t>
       </w:r>
+      <w:proofErr w:type="spellStart"/>
       <w:r>
         <w:rPr>
           <w:lang w:eastAsia="zh-CN"/>
         </w:rPr>
         <w:t>deepcopy</w:t>
       </w:r>
+      <w:proofErr w:type="spellEnd"/>
       <w:r>
         <w:rPr>
           <w:lang w:eastAsia="zh-CN"/>
@@ -13769,8 +14422,16 @@
         <w:rPr>
           <w:lang w:eastAsia="zh-CN"/>
         </w:rPr>
-        <w:t>_should_execute</w:t>
-      </w:r>
+        <w:t>_</w:t>
+      </w:r>
+      <w:proofErr w:type="spellStart"/>
+      <w:r>
+        <w:rPr>
+          <w:lang w:eastAsia="zh-CN"/>
+        </w:rPr>
+        <w:t>should_execute</w:t>
+      </w:r>
+      <w:proofErr w:type="spellEnd"/>
       <w:r>
         <w:rPr>
           <w:lang w:eastAsia="zh-CN"/>
@@ -13813,12 +14474,14 @@
         </w:rPr>
         <w:t>，如果存在</w:t>
       </w:r>
+      <w:proofErr w:type="spellStart"/>
       <w:r>
         <w:rPr>
           <w:lang w:eastAsia="zh-CN"/>
         </w:rPr>
         <w:t>routing_rules</w:t>
       </w:r>
+      <w:proofErr w:type="spellEnd"/>
       <w:r>
         <w:rPr>
           <w:lang w:eastAsia="zh-CN"/>
@@ -13849,12 +14512,14 @@
         </w:rPr>
         <w:t>字段值，检查是否在</w:t>
       </w:r>
+      <w:proofErr w:type="spellStart"/>
       <w:r>
         <w:rPr>
           <w:lang w:eastAsia="zh-CN"/>
         </w:rPr>
         <w:t>routing_rules</w:t>
       </w:r>
+      <w:proofErr w:type="spellEnd"/>
       <w:r>
         <w:rPr>
           <w:lang w:eastAsia="zh-CN"/>
@@ -13893,13 +14558,18 @@
       <w:bookmarkStart w:id="61" w:name="_Toc233630920"/>
       <w:bookmarkStart w:id="62" w:name="_Toc233639373"/>
       <w:r>
-        <w:t>4.2.3 LLM Agent</w:t>
+        <w:t xml:space="preserve">4.2.3 LLM </w:t>
+      </w:r>
+      <w:proofErr w:type="spellStart"/>
+      <w:r>
+        <w:t>Agent</w:t>
       </w:r>
       <w:r>
         <w:t>实现</w:t>
       </w:r>
       <w:bookmarkEnd w:id="61"/>
       <w:bookmarkEnd w:id="62"/>
+      <w:proofErr w:type="spellEnd"/>
     </w:p>
     <w:p>
       <w:pPr>
@@ -13981,6 +14651,7 @@
           <w:lang w:eastAsia="zh-CN"/>
         </w:rPr>
       </w:pPr>
+      <w:proofErr w:type="spellStart"/>
       <w:r>
         <w:t>如果</w:t>
       </w:r>
@@ -14006,7 +14677,11 @@
         <w:t>_run_with_tools</w:t>
       </w:r>
       <w:r>
-        <w:t>进入工具调用循环。</w:t>
+        <w:t>进入工具调用循环</w:t>
+      </w:r>
+      <w:proofErr w:type="spellEnd"/>
+      <w:r>
+        <w:t>。</w:t>
       </w:r>
       <w:r>
         <w:rPr>
@@ -14062,24 +14737,28 @@
         </w:rPr>
         <w:t>通过</w:t>
       </w:r>
+      <w:proofErr w:type="spellStart"/>
       <w:r>
         <w:rPr>
           <w:lang w:eastAsia="zh-CN"/>
         </w:rPr>
         <w:t>ToolRegistry</w:t>
       </w:r>
+      <w:proofErr w:type="spellEnd"/>
       <w:r>
         <w:rPr>
           <w:lang w:eastAsia="zh-CN"/>
         </w:rPr>
         <w:t>的</w:t>
       </w:r>
+      <w:proofErr w:type="spellStart"/>
       <w:r>
         <w:rPr>
           <w:lang w:eastAsia="zh-CN"/>
         </w:rPr>
         <w:t>to_llm_tool_list</w:t>
       </w:r>
+      <w:proofErr w:type="spellEnd"/>
       <w:r>
         <w:rPr>
           <w:lang w:eastAsia="zh-CN"/>
@@ -14122,12 +14801,14 @@
         </w:rPr>
         <w:t>响应包含</w:t>
       </w:r>
+      <w:proofErr w:type="spellStart"/>
       <w:r>
         <w:rPr>
           <w:lang w:eastAsia="zh-CN"/>
         </w:rPr>
         <w:t>tool_calls</w:t>
       </w:r>
+      <w:proofErr w:type="spellEnd"/>
       <w:r>
         <w:rPr>
           <w:lang w:eastAsia="zh-CN"/>
@@ -14146,24 +14827,28 @@
         </w:rPr>
         <w:t>和</w:t>
       </w:r>
+      <w:proofErr w:type="spellStart"/>
       <w:r>
         <w:rPr>
           <w:lang w:eastAsia="zh-CN"/>
         </w:rPr>
         <w:t>function.arguments</w:t>
       </w:r>
+      <w:proofErr w:type="spellEnd"/>
       <w:r>
         <w:rPr>
           <w:lang w:eastAsia="zh-CN"/>
         </w:rPr>
         <w:t>，通过</w:t>
       </w:r>
+      <w:proofErr w:type="spellStart"/>
       <w:r>
         <w:rPr>
           <w:lang w:eastAsia="zh-CN"/>
         </w:rPr>
         <w:t>ToolRegistry</w:t>
       </w:r>
+      <w:proofErr w:type="spellEnd"/>
       <w:r>
         <w:rPr>
           <w:lang w:eastAsia="zh-CN"/>
@@ -14206,11 +14891,19 @@
         </w:rPr>
         <w:t>包含</w:t>
       </w:r>
-      <w:r>
-        <w:rPr>
-          <w:lang w:eastAsia="zh-CN"/>
-        </w:rPr>
-        <w:t>tool_call_id)</w:t>
+      <w:proofErr w:type="spellStart"/>
+      <w:r>
+        <w:rPr>
+          <w:lang w:eastAsia="zh-CN"/>
+        </w:rPr>
+        <w:t>tool_call_id</w:t>
+      </w:r>
+      <w:proofErr w:type="spellEnd"/>
+      <w:r>
+        <w:rPr>
+          <w:lang w:eastAsia="zh-CN"/>
+        </w:rPr>
+        <w:t>)</w:t>
       </w:r>
       <w:r>
         <w:rPr>
@@ -14242,12 +14935,14 @@
         </w:rPr>
         <w:t>使用量，返回包含结果文本、元数据和工具调用日志的</w:t>
       </w:r>
+      <w:proofErr w:type="spellStart"/>
       <w:r>
         <w:rPr>
           <w:lang w:eastAsia="zh-CN"/>
         </w:rPr>
         <w:t>LLMResponse</w:t>
       </w:r>
+      <w:proofErr w:type="spellEnd"/>
       <w:r>
         <w:rPr>
           <w:lang w:eastAsia="zh-CN"/>
@@ -14262,13 +14957,18 @@
       <w:bookmarkStart w:id="63" w:name="_Toc233630921"/>
       <w:bookmarkStart w:id="64" w:name="_Toc233639374"/>
       <w:r>
-        <w:t>4.2.4 DSL</w:t>
+        <w:t xml:space="preserve">4.2.4 </w:t>
+      </w:r>
+      <w:proofErr w:type="spellStart"/>
+      <w:r>
+        <w:t>DSL</w:t>
       </w:r>
       <w:r>
         <w:t>解析器实现</w:t>
       </w:r>
       <w:bookmarkEnd w:id="63"/>
       <w:bookmarkEnd w:id="64"/>
+      <w:proofErr w:type="spellEnd"/>
     </w:p>
     <w:p>
       <w:pPr>
@@ -14412,8 +15112,16 @@
         <w:rPr>
           <w:lang w:eastAsia="zh-CN"/>
         </w:rPr>
-        <w:t>(_parse_components</w:t>
-      </w:r>
+        <w:t>(_</w:t>
+      </w:r>
+      <w:proofErr w:type="spellStart"/>
+      <w:r>
+        <w:rPr>
+          <w:lang w:eastAsia="zh-CN"/>
+        </w:rPr>
+        <w:t>parse_components</w:t>
+      </w:r>
+      <w:proofErr w:type="spellEnd"/>
       <w:r>
         <w:rPr>
           <w:lang w:eastAsia="zh-CN"/>
@@ -14448,8 +15156,16 @@
         <w:rPr>
           <w:lang w:eastAsia="zh-CN"/>
         </w:rPr>
-        <w:t>_extract_block</w:t>
-      </w:r>
+        <w:t>_</w:t>
+      </w:r>
+      <w:proofErr w:type="spellStart"/>
+      <w:r>
+        <w:rPr>
+          <w:lang w:eastAsia="zh-CN"/>
+        </w:rPr>
+        <w:t>extract_block</w:t>
+      </w:r>
+      <w:proofErr w:type="spellEnd"/>
       <w:r>
         <w:rPr>
           <w:lang w:eastAsia="zh-CN"/>
@@ -14480,12 +15196,14 @@
         </w:rPr>
         <w:t>，然后用独立的正则表达式解析</w:t>
       </w:r>
+      <w:proofErr w:type="spellStart"/>
       <w:r>
         <w:rPr>
           <w:lang w:eastAsia="zh-CN"/>
         </w:rPr>
         <w:t>system_prompt</w:t>
       </w:r>
+      <w:proofErr w:type="spellEnd"/>
       <w:r>
         <w:rPr>
           <w:lang w:eastAsia="zh-CN"/>
@@ -14516,12 +15234,14 @@
         </w:rPr>
         <w:t>、</w:t>
       </w:r>
+      <w:proofErr w:type="spellStart"/>
       <w:r>
         <w:rPr>
           <w:lang w:eastAsia="zh-CN"/>
         </w:rPr>
         <w:t>mcp</w:t>
       </w:r>
+      <w:proofErr w:type="spellEnd"/>
       <w:r>
         <w:rPr>
           <w:lang w:eastAsia="zh-CN"/>
@@ -14631,7 +15351,11 @@
         <w:t>((A, B, C))</w:t>
       </w:r>
       <w:r>
-        <w:t>，右侧处理单个</w:t>
+        <w:t>，</w:t>
+      </w:r>
+      <w:proofErr w:type="spellStart"/>
+      <w:r>
+        <w:t>右侧处理单个</w:t>
       </w:r>
       <w:r>
         <w:t>Agent</w:t>
@@ -14639,17 +15363,26 @@
       <w:r>
         <w:t>引用和广播语法</w:t>
       </w:r>
+      <w:proofErr w:type="spellEnd"/>
       <w:r>
         <w:t>((B, C, D))</w:t>
       </w:r>
       <w:r>
-        <w:t>。解析结果构建为</w:t>
+        <w:t>。</w:t>
+      </w:r>
+      <w:proofErr w:type="spellStart"/>
+      <w:r>
+        <w:t>解析结果构建为</w:t>
       </w:r>
       <w:r>
         <w:t>Connection</w:t>
       </w:r>
       <w:r>
-        <w:t>对象列表。</w:t>
+        <w:t>对象列表</w:t>
+      </w:r>
+      <w:proofErr w:type="spellEnd"/>
+      <w:r>
+        <w:t>。</w:t>
       </w:r>
     </w:p>
     <w:p>
@@ -14659,13 +15392,18 @@
       <w:bookmarkStart w:id="65" w:name="_Toc233630922"/>
       <w:bookmarkStart w:id="66" w:name="_Toc233639375"/>
       <w:r>
-        <w:t>4.2.5 REPL</w:t>
+        <w:t xml:space="preserve">4.2.5 </w:t>
+      </w:r>
+      <w:proofErr w:type="spellStart"/>
+      <w:r>
+        <w:t>REPL</w:t>
       </w:r>
       <w:r>
         <w:t>终端实现</w:t>
       </w:r>
       <w:bookmarkEnd w:id="65"/>
       <w:bookmarkEnd w:id="66"/>
+      <w:proofErr w:type="spellEnd"/>
     </w:p>
     <w:p>
       <w:pPr>
@@ -15062,12 +15800,14 @@
         </w:rPr>
         <w:t>系统采用</w:t>
       </w:r>
+      <w:proofErr w:type="spellStart"/>
       <w:r>
         <w:rPr>
           <w:lang w:eastAsia="zh-CN"/>
         </w:rPr>
         <w:t>pytest</w:t>
       </w:r>
+      <w:proofErr w:type="spellEnd"/>
       <w:r>
         <w:rPr>
           <w:lang w:eastAsia="zh-CN"/>
@@ -15471,6 +16211,7 @@
             <w:pPr>
               <w:jc w:val="center"/>
             </w:pPr>
+            <w:proofErr w:type="spellStart"/>
             <w:r>
               <w:rPr>
                 <w:b/>
@@ -15478,6 +16219,7 @@
               </w:rPr>
               <w:t>模块</w:t>
             </w:r>
+            <w:proofErr w:type="spellEnd"/>
           </w:p>
         </w:tc>
         <w:tc>
@@ -15488,6 +16230,7 @@
             <w:pPr>
               <w:jc w:val="center"/>
             </w:pPr>
+            <w:proofErr w:type="spellStart"/>
             <w:r>
               <w:rPr>
                 <w:b/>
@@ -15495,6 +16238,7 @@
               </w:rPr>
               <w:t>测试文件</w:t>
             </w:r>
+            <w:proofErr w:type="spellEnd"/>
           </w:p>
         </w:tc>
         <w:tc>
@@ -15505,6 +16249,7 @@
             <w:pPr>
               <w:jc w:val="center"/>
             </w:pPr>
+            <w:proofErr w:type="spellStart"/>
             <w:r>
               <w:rPr>
                 <w:b/>
@@ -15512,6 +16257,7 @@
               </w:rPr>
               <w:t>用例数</w:t>
             </w:r>
+            <w:proofErr w:type="spellEnd"/>
           </w:p>
         </w:tc>
       </w:tr>
@@ -15524,6 +16270,7 @@
             <w:pPr>
               <w:jc w:val="center"/>
             </w:pPr>
+            <w:proofErr w:type="spellStart"/>
             <w:r>
               <w:rPr>
                 <w:sz w:val="21"/>
@@ -15536,6 +16283,7 @@
               </w:rPr>
               <w:t>引擎</w:t>
             </w:r>
+            <w:proofErr w:type="spellEnd"/>
           </w:p>
         </w:tc>
         <w:tc>
@@ -15586,12 +16334,14 @@
             <w:pPr>
               <w:jc w:val="center"/>
             </w:pPr>
+            <w:proofErr w:type="spellStart"/>
             <w:r>
               <w:rPr>
                 <w:sz w:val="21"/>
               </w:rPr>
               <w:t>调度器</w:t>
             </w:r>
+            <w:proofErr w:type="spellEnd"/>
           </w:p>
         </w:tc>
         <w:tc>
@@ -15642,6 +16392,7 @@
             <w:pPr>
               <w:jc w:val="center"/>
             </w:pPr>
+            <w:proofErr w:type="spellStart"/>
             <w:r>
               <w:rPr>
                 <w:sz w:val="21"/>
@@ -15654,6 +16405,7 @@
               </w:rPr>
               <w:t>解析器</w:t>
             </w:r>
+            <w:proofErr w:type="spellEnd"/>
           </w:p>
         </w:tc>
         <w:tc>
@@ -15704,12 +16456,14 @@
             <w:pPr>
               <w:jc w:val="center"/>
             </w:pPr>
+            <w:proofErr w:type="spellStart"/>
             <w:r>
               <w:rPr>
                 <w:sz w:val="21"/>
               </w:rPr>
               <w:t>工具系统</w:t>
             </w:r>
+            <w:proofErr w:type="spellEnd"/>
           </w:p>
         </w:tc>
         <w:tc>
@@ -15760,6 +16514,7 @@
             <w:pPr>
               <w:jc w:val="center"/>
             </w:pPr>
+            <w:proofErr w:type="spellStart"/>
             <w:r>
               <w:rPr>
                 <w:sz w:val="21"/>
@@ -15772,6 +16527,7 @@
               </w:rPr>
               <w:t>组件</w:t>
             </w:r>
+            <w:proofErr w:type="spellEnd"/>
           </w:p>
         </w:tc>
         <w:tc>
@@ -15822,6 +16578,7 @@
             <w:pPr>
               <w:jc w:val="center"/>
             </w:pPr>
+            <w:proofErr w:type="spellStart"/>
             <w:r>
               <w:rPr>
                 <w:sz w:val="21"/>
@@ -15834,6 +16591,7 @@
               </w:rPr>
               <w:t>终端</w:t>
             </w:r>
+            <w:proofErr w:type="spellEnd"/>
           </w:p>
         </w:tc>
         <w:tc>
@@ -15884,12 +16642,14 @@
             <w:pPr>
               <w:jc w:val="center"/>
             </w:pPr>
+            <w:proofErr w:type="spellStart"/>
             <w:r>
               <w:rPr>
                 <w:sz w:val="21"/>
               </w:rPr>
               <w:t>其他模块</w:t>
             </w:r>
+            <w:proofErr w:type="spellEnd"/>
           </w:p>
         </w:tc>
         <w:tc>
@@ -15900,12 +16660,14 @@
             <w:pPr>
               <w:jc w:val="center"/>
             </w:pPr>
+            <w:proofErr w:type="spellStart"/>
             <w:r>
               <w:rPr>
                 <w:sz w:val="21"/>
               </w:rPr>
               <w:t>多个测试文件</w:t>
             </w:r>
+            <w:proofErr w:type="spellEnd"/>
           </w:p>
         </w:tc>
         <w:tc>
@@ -15956,11 +16718,13 @@
       <w:r>
         <w:t xml:space="preserve"> </w:t>
       </w:r>
+      <w:proofErr w:type="spellStart"/>
       <w:r>
         <w:t>总结与展望</w:t>
       </w:r>
       <w:bookmarkEnd w:id="69"/>
       <w:bookmarkEnd w:id="70"/>
+      <w:proofErr w:type="spellEnd"/>
     </w:p>
     <w:p>
       <w:pPr>
@@ -15971,11 +16735,13 @@
       <w:r>
         <w:t xml:space="preserve">5.1 </w:t>
       </w:r>
+      <w:proofErr w:type="spellStart"/>
       <w:r>
         <w:t>总结</w:t>
       </w:r>
       <w:bookmarkEnd w:id="71"/>
       <w:bookmarkEnd w:id="72"/>
+      <w:proofErr w:type="spellEnd"/>
     </w:p>
     <w:p>
       <w:pPr>
@@ -15991,12 +16757,14 @@
         </w:rPr>
         <w:t>本文设计并实现了一个名为</w:t>
       </w:r>
+      <w:proofErr w:type="spellStart"/>
       <w:r>
         <w:rPr>
           <w:lang w:eastAsia="zh-CN"/>
         </w:rPr>
         <w:t>GrassFlow</w:t>
       </w:r>
+      <w:proofErr w:type="spellEnd"/>
       <w:r>
         <w:rPr>
           <w:lang w:eastAsia="zh-CN"/>
@@ -16090,12 +16858,14 @@
         </w:rPr>
         <w:t>。调度器基于</w:t>
       </w:r>
+      <w:proofErr w:type="spellStart"/>
       <w:r>
         <w:rPr>
           <w:lang w:eastAsia="zh-CN"/>
         </w:rPr>
         <w:t>asyncio</w:t>
       </w:r>
+      <w:proofErr w:type="spellEnd"/>
       <w:r>
         <w:rPr>
           <w:lang w:eastAsia="zh-CN"/>
@@ -16546,12 +17316,14 @@
         </w:rPr>
         <w:t>第三，引入上下文压缩机制。当前系统已实现</w:t>
       </w:r>
+      <w:proofErr w:type="spellStart"/>
       <w:r>
         <w:rPr>
           <w:lang w:eastAsia="zh-CN"/>
         </w:rPr>
         <w:t>ContextCompressor</w:t>
       </w:r>
+      <w:proofErr w:type="spellEnd"/>
       <w:r>
         <w:rPr>
           <w:lang w:eastAsia="zh-CN"/>
@@ -16633,6 +17405,7 @@
       <w:r>
         <w:t>A2A(Agent-to-Agent)</w:t>
       </w:r>
+      <w:proofErr w:type="spellStart"/>
       <w:r>
         <w:t>协议支持，使不同平台的</w:t>
       </w:r>
@@ -16640,7 +17413,11 @@
         <w:t>Agent</w:t>
       </w:r>
       <w:r>
-        <w:t>能够相互发现和调用。</w:t>
+        <w:t>能够相互发现和调用</w:t>
+      </w:r>
+      <w:proofErr w:type="spellEnd"/>
+      <w:r>
+        <w:t>。</w:t>
       </w:r>
     </w:p>
     <w:p>
@@ -16679,13 +17456,6 @@
           <w:lang w:eastAsia="zh-CN"/>
         </w:rPr>
       </w:pPr>
-      <w:r>
-        <w:rPr>
-          <w:lang w:eastAsia="zh-CN"/>
-        </w:rPr>
-        <w:lastRenderedPageBreak/>
-        <w:br w:type="page"/>
-      </w:r>
     </w:p>
     <w:p>
       <w:pPr>
@@ -16693,12 +17463,13 @@
       </w:pPr>
       <w:bookmarkStart w:id="75" w:name="_Toc233630927"/>
       <w:bookmarkStart w:id="76" w:name="_Toc233639380"/>
-      <w:r>
-        <w:lastRenderedPageBreak/>
+      <w:proofErr w:type="spellStart"/>
+      <w:r>
         <w:t>参考文献</w:t>
       </w:r>
       <w:bookmarkEnd w:id="75"/>
       <w:bookmarkEnd w:id="76"/>
+      <w:proofErr w:type="spellEnd"/>
     </w:p>
     <w:p>
       <w:pPr>
@@ -16708,7 +17479,21 @@
         <w:rPr>
           <w:sz w:val="21"/>
         </w:rPr>
-        <w:t>[1] Vaswani A, Shazeer N, Parmar N, et al. Attention is all you need[C]//Advances in Neural Information Processing Systems. 2017: 5998-6008.</w:t>
+        <w:t xml:space="preserve">[1] Vaswani A, </w:t>
+      </w:r>
+      <w:proofErr w:type="spellStart"/>
+      <w:r>
+        <w:rPr>
+          <w:sz w:val="21"/>
+        </w:rPr>
+        <w:t>Shazeer</w:t>
+      </w:r>
+      <w:proofErr w:type="spellEnd"/>
+      <w:r>
+        <w:rPr>
+          <w:sz w:val="21"/>
+        </w:rPr>
+        <w:t xml:space="preserve"> N, Parmar N, et al. Attention is all you need[C]//Advances in Neural Information Processing Systems. 2017: 5998-6008.</w:t>
       </w:r>
     </w:p>
     <w:p>
@@ -16719,35 +17504,7 @@
         <w:rPr>
           <w:sz w:val="21"/>
         </w:rPr>
-        <w:t xml:space="preserve">[2] OpenAI. GPT-4 technical </w:t>
-      </w:r>
-      <w:proofErr w:type="gramStart"/>
-      <w:r>
-        <w:rPr>
-          <w:sz w:val="21"/>
-        </w:rPr>
-        <w:t>report[</w:t>
-      </w:r>
-      <w:proofErr w:type="gramEnd"/>
-      <w:r>
-        <w:rPr>
-          <w:sz w:val="21"/>
-        </w:rPr>
-        <w:t>EB/OL]. (2023-03-</w:t>
-      </w:r>
-      <w:proofErr w:type="gramStart"/>
-      <w:r>
-        <w:rPr>
-          <w:sz w:val="21"/>
-        </w:rPr>
-        <w:t>27)[</w:t>
-      </w:r>
-      <w:proofErr w:type="gramEnd"/>
-      <w:r>
-        <w:rPr>
-          <w:sz w:val="21"/>
-        </w:rPr>
-        <w:t>2024-01-15]. https://arxiv.org/abs/2303.08774.</w:t>
+        <w:t>[2] OpenAI. GPT-4 technical report[EB/OL]. (2023-03-27)[2024-01-15]. https://arxiv.org/abs/2303.08774.</w:t>
       </w:r>
     </w:p>
     <w:p>
@@ -16758,35 +17515,7 @@
         <w:rPr>
           <w:sz w:val="21"/>
         </w:rPr>
-        <w:t xml:space="preserve">[3] Anthropic. Claude 3.5 sonnet model </w:t>
-      </w:r>
-      <w:proofErr w:type="gramStart"/>
-      <w:r>
-        <w:rPr>
-          <w:sz w:val="21"/>
-        </w:rPr>
-        <w:t>card[</w:t>
-      </w:r>
-      <w:proofErr w:type="gramEnd"/>
-      <w:r>
-        <w:rPr>
-          <w:sz w:val="21"/>
-        </w:rPr>
-        <w:t>EB/OL]. (2024-06-</w:t>
-      </w:r>
-      <w:proofErr w:type="gramStart"/>
-      <w:r>
-        <w:rPr>
-          <w:sz w:val="21"/>
-        </w:rPr>
-        <w:t>20)[</w:t>
-      </w:r>
-      <w:proofErr w:type="gramEnd"/>
-      <w:r>
-        <w:rPr>
-          <w:sz w:val="21"/>
-        </w:rPr>
-        <w:t>2024-07-01]. https://docs.anthropic.com/en/docs/about-claude/model-card.</w:t>
+        <w:t>[3] Anthropic. Claude 3.5 sonnet model card[EB/OL]. (2024-06-20)[2024-07-01]. https://docs.anthropic.com/en/docs/about-claude/model-card.</w:t>
       </w:r>
     </w:p>
     <w:p>
@@ -16797,35 +17526,7 @@
         <w:rPr>
           <w:sz w:val="21"/>
         </w:rPr>
-        <w:t xml:space="preserve">[4] DeepSeek-AI. DeepSeek-V3 technical </w:t>
-      </w:r>
-      <w:proofErr w:type="gramStart"/>
-      <w:r>
-        <w:rPr>
-          <w:sz w:val="21"/>
-        </w:rPr>
-        <w:t>report[</w:t>
-      </w:r>
-      <w:proofErr w:type="gramEnd"/>
-      <w:r>
-        <w:rPr>
-          <w:sz w:val="21"/>
-        </w:rPr>
-        <w:t>EB/OL]. (2024-12-</w:t>
-      </w:r>
-      <w:proofErr w:type="gramStart"/>
-      <w:r>
-        <w:rPr>
-          <w:sz w:val="21"/>
-        </w:rPr>
-        <w:t>27)[</w:t>
-      </w:r>
-      <w:proofErr w:type="gramEnd"/>
-      <w:r>
-        <w:rPr>
-          <w:sz w:val="21"/>
-        </w:rPr>
-        <w:t>2025-01-10]. https://arxiv.org/abs/2412.19437.</w:t>
+        <w:t>[4] DeepSeek-AI. DeepSeek-V3 technical report[EB/OL]. (2024-12-27)[2025-01-10]. https://arxiv.org/abs/2412.19437.</w:t>
       </w:r>
     </w:p>
     <w:p>
@@ -16836,7 +17537,21 @@
         <w:rPr>
           <w:sz w:val="21"/>
         </w:rPr>
-        <w:t>[5] Yao S, Zhao J, Yu D, et al. ReAct: synergizing reasoning and acting in language models[C]//International Conference on Learning Representations. 2023.</w:t>
+        <w:t xml:space="preserve">[5] Yao S, Zhao J, Yu D, et al. </w:t>
+      </w:r>
+      <w:proofErr w:type="spellStart"/>
+      <w:r>
+        <w:rPr>
+          <w:sz w:val="21"/>
+        </w:rPr>
+        <w:t>ReAct</w:t>
+      </w:r>
+      <w:proofErr w:type="spellEnd"/>
+      <w:r>
+        <w:rPr>
+          <w:sz w:val="21"/>
+        </w:rPr>
+        <w:t>: synergizing reasoning and acting in language models[C]//International Conference on Learning Representations. 2023.</w:t>
       </w:r>
     </w:p>
     <w:p>
@@ -16847,49 +17562,7 @@
         <w:rPr>
           <w:sz w:val="21"/>
         </w:rPr>
-        <w:t xml:space="preserve">[6] Xi Z, Chen W, Guo X, et al. The rise and potential of large language </w:t>
-      </w:r>
-      <w:proofErr w:type="gramStart"/>
-      <w:r>
-        <w:rPr>
-          <w:sz w:val="21"/>
-        </w:rPr>
-        <w:t>model based</w:t>
-      </w:r>
-      <w:proofErr w:type="gramEnd"/>
-      <w:r>
-        <w:rPr>
-          <w:sz w:val="21"/>
-        </w:rPr>
-        <w:t xml:space="preserve"> agents: a </w:t>
-      </w:r>
-      <w:proofErr w:type="gramStart"/>
-      <w:r>
-        <w:rPr>
-          <w:sz w:val="21"/>
-        </w:rPr>
-        <w:t>survey[</w:t>
-      </w:r>
-      <w:proofErr w:type="gramEnd"/>
-      <w:r>
-        <w:rPr>
-          <w:sz w:val="21"/>
-        </w:rPr>
-        <w:t>EB/OL]. (2023-09-</w:t>
-      </w:r>
-      <w:proofErr w:type="gramStart"/>
-      <w:r>
-        <w:rPr>
-          <w:sz w:val="21"/>
-        </w:rPr>
-        <w:t>14)[</w:t>
-      </w:r>
-      <w:proofErr w:type="gramEnd"/>
-      <w:r>
-        <w:rPr>
-          <w:sz w:val="21"/>
-        </w:rPr>
-        <w:t>2024-03-20]. https://arxiv.org/abs/2309.07864.</w:t>
+        <w:t>[6] Xi Z, Chen W, Guo X, et al. The rise and potential of large language model based agents: a survey[EB/OL]. (2023-09-14)[2024-03-20]. https://arxiv.org/abs/2309.07864.</w:t>
       </w:r>
     </w:p>
     <w:p>
@@ -16922,35 +17595,21 @@
         <w:rPr>
           <w:sz w:val="21"/>
         </w:rPr>
-        <w:t xml:space="preserve">[9] MongoDB Inc. LiteLLM: a lightweight library to call 100+ LLM </w:t>
-      </w:r>
-      <w:proofErr w:type="gramStart"/>
+        <w:t xml:space="preserve">[9] MongoDB Inc. </w:t>
+      </w:r>
+      <w:proofErr w:type="spellStart"/>
       <w:r>
         <w:rPr>
           <w:sz w:val="21"/>
         </w:rPr>
-        <w:t>APIs[</w:t>
-      </w:r>
-      <w:proofErr w:type="gramEnd"/>
+        <w:t>LiteLLM</w:t>
+      </w:r>
+      <w:proofErr w:type="spellEnd"/>
       <w:r>
         <w:rPr>
           <w:sz w:val="21"/>
         </w:rPr>
-        <w:t>EB/OL]. (2023-10-</w:t>
-      </w:r>
-      <w:proofErr w:type="gramStart"/>
-      <w:r>
-        <w:rPr>
-          <w:sz w:val="21"/>
-        </w:rPr>
-        <w:t>01)[</w:t>
-      </w:r>
-      <w:proofErr w:type="gramEnd"/>
-      <w:r>
-        <w:rPr>
-          <w:sz w:val="21"/>
-        </w:rPr>
-        <w:t>2025-03-15]. https://github.com/BerriAI/litellm.</w:t>
+        <w:t>: a lightweight library to call 100+ LLM APIs[EB/OL]. (2023-10-01)[2025-03-15]. https://github.com/BerriAI/litellm.</w:t>
       </w:r>
     </w:p>
     <w:p>
@@ -16961,49 +17620,7 @@
         <w:rPr>
           <w:sz w:val="21"/>
         </w:rPr>
-        <w:t xml:space="preserve">[10] Montgomerie A. Rich: </w:t>
-      </w:r>
-      <w:proofErr w:type="gramStart"/>
-      <w:r>
-        <w:rPr>
-          <w:sz w:val="21"/>
-        </w:rPr>
-        <w:t>a</w:t>
-      </w:r>
-      <w:proofErr w:type="gramEnd"/>
-      <w:r>
-        <w:rPr>
-          <w:sz w:val="21"/>
-        </w:rPr>
-        <w:t xml:space="preserve"> Python library for rich text and beautiful </w:t>
-      </w:r>
-      <w:proofErr w:type="gramStart"/>
-      <w:r>
-        <w:rPr>
-          <w:sz w:val="21"/>
-        </w:rPr>
-        <w:t>formatting[</w:t>
-      </w:r>
-      <w:proofErr w:type="gramEnd"/>
-      <w:r>
-        <w:rPr>
-          <w:sz w:val="21"/>
-        </w:rPr>
-        <w:t>EB/OL]. (2020-05-</w:t>
-      </w:r>
-      <w:proofErr w:type="gramStart"/>
-      <w:r>
-        <w:rPr>
-          <w:sz w:val="21"/>
-        </w:rPr>
-        <w:t>01)[</w:t>
-      </w:r>
-      <w:proofErr w:type="gramEnd"/>
-      <w:r>
-        <w:rPr>
-          <w:sz w:val="21"/>
-        </w:rPr>
-        <w:t>2025-03-15]. https://github.com/Textualize/rich.</w:t>
+        <w:t>[10] Montgomerie A. Rich: a Python library for rich text and beautiful formatting[EB/OL]. (2020-05-01)[2025-03-15]. https://github.com/Textualize/rich.</w:t>
       </w:r>
     </w:p>
     <w:p>
@@ -17014,35 +17631,21 @@
         <w:rPr>
           <w:sz w:val="21"/>
         </w:rPr>
-        <w:t xml:space="preserve">[11] Slavin R, Hosseini R. prompt_toolkit: a library for building powerful interactive command lines in </w:t>
-      </w:r>
-      <w:proofErr w:type="gramStart"/>
+        <w:t xml:space="preserve">[11] Slavin R, Hosseini R. </w:t>
+      </w:r>
+      <w:proofErr w:type="spellStart"/>
       <w:r>
         <w:rPr>
           <w:sz w:val="21"/>
         </w:rPr>
-        <w:t>Python[</w:t>
-      </w:r>
-      <w:proofErr w:type="gramEnd"/>
+        <w:t>prompt_toolkit</w:t>
+      </w:r>
+      <w:proofErr w:type="spellEnd"/>
       <w:r>
         <w:rPr>
           <w:sz w:val="21"/>
         </w:rPr>
-        <w:t>EB/OL]. (2014-01-</w:t>
-      </w:r>
-      <w:proofErr w:type="gramStart"/>
-      <w:r>
-        <w:rPr>
-          <w:sz w:val="21"/>
-        </w:rPr>
-        <w:t>01)[</w:t>
-      </w:r>
-      <w:proofErr w:type="gramEnd"/>
-      <w:r>
-        <w:rPr>
-          <w:sz w:val="21"/>
-        </w:rPr>
-        <w:t>2025-03-15]. https://github.com/prompt-toolkit/python-prompt-toolkit.</w:t>
+        <w:t>: a library for building powerful interactive command lines in Python[EB/OL]. (2014-01-01)[2025-03-15]. https://github.com/prompt-toolkit/python-prompt-toolkit.</w:t>
       </w:r>
     </w:p>
     <w:p>
@@ -17064,21 +17667,21 @@
         <w:rPr>
           <w:sz w:val="21"/>
         </w:rPr>
-        <w:t>[13] Python Software Foundation. asyncio — Asynchronous I/O[EB/OL]. (2024-01-</w:t>
-      </w:r>
-      <w:proofErr w:type="gramStart"/>
+        <w:t xml:space="preserve">[13] Python Software Foundation. </w:t>
+      </w:r>
+      <w:proofErr w:type="spellStart"/>
       <w:r>
         <w:rPr>
           <w:sz w:val="21"/>
         </w:rPr>
-        <w:t>01)[</w:t>
-      </w:r>
-      <w:proofErr w:type="gramEnd"/>
+        <w:t>asyncio</w:t>
+      </w:r>
+      <w:proofErr w:type="spellEnd"/>
       <w:r>
         <w:rPr>
           <w:sz w:val="21"/>
         </w:rPr>
-        <w:t>2025-03-15]. https://docs.python.org/3/library/asyncio.html.</w:t>
+        <w:t xml:space="preserve"> — Asynchronous I/O[EB/OL]. (2024-01-01)[2025-03-15]. https://docs.python.org/3/library/asyncio.html.</w:t>
       </w:r>
     </w:p>
     <w:p>
@@ -17089,35 +17692,35 @@
         <w:rPr>
           <w:sz w:val="21"/>
         </w:rPr>
-        <w:t xml:space="preserve">[14] FastAPI. FastAPI framework, high performance, easy to learn, fast to code, ready for </w:t>
-      </w:r>
-      <w:proofErr w:type="gramStart"/>
+        <w:t xml:space="preserve">[14] </w:t>
+      </w:r>
+      <w:proofErr w:type="spellStart"/>
       <w:r>
         <w:rPr>
           <w:sz w:val="21"/>
         </w:rPr>
-        <w:t>production[</w:t>
-      </w:r>
-      <w:proofErr w:type="gramEnd"/>
+        <w:t>FastAPI</w:t>
+      </w:r>
+      <w:proofErr w:type="spellEnd"/>
       <w:r>
         <w:rPr>
           <w:sz w:val="21"/>
         </w:rPr>
-        <w:t>EB/OL]. (2024-01-</w:t>
-      </w:r>
-      <w:proofErr w:type="gramStart"/>
+        <w:t xml:space="preserve">. </w:t>
+      </w:r>
+      <w:proofErr w:type="spellStart"/>
       <w:r>
         <w:rPr>
           <w:sz w:val="21"/>
         </w:rPr>
-        <w:t>01)[</w:t>
-      </w:r>
-      <w:proofErr w:type="gramEnd"/>
+        <w:t>FastAPI</w:t>
+      </w:r>
+      <w:proofErr w:type="spellEnd"/>
       <w:r>
         <w:rPr>
           <w:sz w:val="21"/>
         </w:rPr>
-        <w:t>2025-03-15]. https://fastapi.tiangolo.com/.</w:t>
+        <w:t xml:space="preserve"> framework, high performance, easy to learn, fast to code, ready for production[EB/OL]. (2024-01-01)[2025-03-15]. https://fastapi.tiangolo.com/.</w:t>
       </w:r>
     </w:p>
     <w:p>
@@ -17131,35 +17734,21 @@
         <w:rPr>
           <w:sz w:val="21"/>
         </w:rPr>
-        <w:t xml:space="preserve">[15] SchemaOrg. JSON Schema: a vocabulary that allows you to annotate and validate JSON </w:t>
-      </w:r>
-      <w:proofErr w:type="gramStart"/>
+        <w:t xml:space="preserve">[15] </w:t>
+      </w:r>
+      <w:proofErr w:type="spellStart"/>
       <w:r>
         <w:rPr>
           <w:sz w:val="21"/>
         </w:rPr>
-        <w:t>documents[</w:t>
-      </w:r>
-      <w:proofErr w:type="gramEnd"/>
+        <w:t>SchemaOrg</w:t>
+      </w:r>
+      <w:proofErr w:type="spellEnd"/>
       <w:r>
         <w:rPr>
           <w:sz w:val="21"/>
         </w:rPr>
-        <w:t>EB/OL]. (2024-01-</w:t>
-      </w:r>
-      <w:proofErr w:type="gramStart"/>
-      <w:r>
-        <w:rPr>
-          <w:sz w:val="21"/>
-        </w:rPr>
-        <w:t>01)[</w:t>
-      </w:r>
-      <w:proofErr w:type="gramEnd"/>
-      <w:r>
-        <w:rPr>
-          <w:sz w:val="21"/>
-        </w:rPr>
-        <w:t>2025-03-15]. https://json-schema.org/.</w:t>
+        <w:t>. JSON Schema: a vocabulary that allows you to annotate and validate JSON documents[EB/OL]. (2024-01-01)[2025-03-15]. https://json-schema.org/.</w:t>
       </w:r>
     </w:p>
     <w:p>
@@ -17173,21 +17762,8 @@
         <w:rPr>
           <w:sz w:val="21"/>
         </w:rPr>
-        <w:t>[16] OpenAI. Introducing GPT-5[EB/OL]. (2025-08-</w:t>
-      </w:r>
-      <w:proofErr w:type="gramStart"/>
-      <w:r>
-        <w:rPr>
-          <w:sz w:val="21"/>
-        </w:rPr>
-        <w:t>07)[</w:t>
-      </w:r>
-      <w:proofErr w:type="gramEnd"/>
-      <w:r>
-        <w:rPr>
-          <w:sz w:val="21"/>
-        </w:rPr>
-        <w:t>2025-10-01]. https://openai.com/index/introducing-gpt-5.</w:t>
+        <w:lastRenderedPageBreak/>
+        <w:t>[16] OpenAI. Introducing GPT-5[EB/OL]. (2025-08-07)[2025-10-01]. https://openai.com/index/introducing-gpt-5.</w:t>
       </w:r>
     </w:p>
     <w:p>
@@ -17201,22 +17777,7 @@
         <w:rPr>
           <w:sz w:val="21"/>
         </w:rPr>
-        <w:lastRenderedPageBreak/>
-        <w:t>[17] Anthropic. Introducing Claude Opus 4 and Claude Sonnet 4[EB/OL]. (2025-05-</w:t>
-      </w:r>
-      <w:proofErr w:type="gramStart"/>
-      <w:r>
-        <w:rPr>
-          <w:sz w:val="21"/>
-        </w:rPr>
-        <w:t>22)[</w:t>
-      </w:r>
-      <w:proofErr w:type="gramEnd"/>
-      <w:r>
-        <w:rPr>
-          <w:sz w:val="21"/>
-        </w:rPr>
-        <w:t>2025-06-01]. https://www.anthropic.com/news/claude-4.</w:t>
+        <w:t>[17] Anthropic. Introducing Claude Opus 4 and Claude Sonnet 4[EB/OL]. (2025-05-22)[2025-06-01]. https://www.anthropic.com/news/claude-4.</w:t>
       </w:r>
     </w:p>
     <w:p>
@@ -17230,35 +17791,7 @@
         <w:rPr>
           <w:sz w:val="21"/>
         </w:rPr>
-        <w:t xml:space="preserve">[18] DeepSeek-AI. DeepSeek-V4 technical </w:t>
-      </w:r>
-      <w:proofErr w:type="gramStart"/>
-      <w:r>
-        <w:rPr>
-          <w:sz w:val="21"/>
-        </w:rPr>
-        <w:t>report[</w:t>
-      </w:r>
-      <w:proofErr w:type="gramEnd"/>
-      <w:r>
-        <w:rPr>
-          <w:sz w:val="21"/>
-        </w:rPr>
-        <w:t>EB/OL]. (2026-04-</w:t>
-      </w:r>
-      <w:proofErr w:type="gramStart"/>
-      <w:r>
-        <w:rPr>
-          <w:sz w:val="21"/>
-        </w:rPr>
-        <w:t>24)[</w:t>
-      </w:r>
-      <w:proofErr w:type="gramEnd"/>
-      <w:r>
-        <w:rPr>
-          <w:sz w:val="21"/>
-        </w:rPr>
-        <w:t>2026-05-01]. https://api-docs.deepseek.com/updates.</w:t>
+        <w:t>[18] DeepSeek-AI. DeepSeek-V4 technical report[EB/OL]. (2026-04-24)[2026-05-01]. https://api-docs.deepseek.com/updates.</w:t>
       </w:r>
     </w:p>
     <w:p>
@@ -17272,35 +17805,7 @@
         <w:rPr>
           <w:sz w:val="21"/>
         </w:rPr>
-        <w:t xml:space="preserve">[19] DeepSeek-AI. DeepSeek-R1: incentivizing reasoning capability in LLMs via reinforcement </w:t>
-      </w:r>
-      <w:proofErr w:type="gramStart"/>
-      <w:r>
-        <w:rPr>
-          <w:sz w:val="21"/>
-        </w:rPr>
-        <w:t>learning[</w:t>
-      </w:r>
-      <w:proofErr w:type="gramEnd"/>
-      <w:r>
-        <w:rPr>
-          <w:sz w:val="21"/>
-        </w:rPr>
-        <w:t>EB/OL]. (2025-01-</w:t>
-      </w:r>
-      <w:proofErr w:type="gramStart"/>
-      <w:r>
-        <w:rPr>
-          <w:sz w:val="21"/>
-        </w:rPr>
-        <w:t>20)[</w:t>
-      </w:r>
-      <w:proofErr w:type="gramEnd"/>
-      <w:r>
-        <w:rPr>
-          <w:sz w:val="21"/>
-        </w:rPr>
-        <w:t>2025-03-01]. https://arxiv.org/abs/2501.12948.</w:t>
+        <w:t>[19] DeepSeek-AI. DeepSeek-R1: incentivizing reasoning capability in LLMs via reinforcement learning[EB/OL]. (2025-01-20)[2025-03-01]. https://arxiv.org/abs/2501.12948.</w:t>
       </w:r>
     </w:p>
     <w:p>
@@ -17311,35 +17816,7 @@
         <w:rPr>
           <w:sz w:val="21"/>
         </w:rPr>
-        <w:t>[20] OpenAI. Introducing OpenAI o3 and o4-</w:t>
-      </w:r>
-      <w:proofErr w:type="gramStart"/>
-      <w:r>
-        <w:rPr>
-          <w:sz w:val="21"/>
-        </w:rPr>
-        <w:t>mini[</w:t>
-      </w:r>
-      <w:proofErr w:type="gramEnd"/>
-      <w:r>
-        <w:rPr>
-          <w:sz w:val="21"/>
-        </w:rPr>
-        <w:t>EB/OL]. (2025-04-</w:t>
-      </w:r>
-      <w:proofErr w:type="gramStart"/>
-      <w:r>
-        <w:rPr>
-          <w:sz w:val="21"/>
-        </w:rPr>
-        <w:t>16)[</w:t>
-      </w:r>
-      <w:proofErr w:type="gramEnd"/>
-      <w:r>
-        <w:rPr>
-          <w:sz w:val="21"/>
-        </w:rPr>
-        <w:t>2025-05-01]. https://openai.com/index/introducing-o3-and-o4-mini.</w:t>
+        <w:t>[20] OpenAI. Introducing OpenAI o3 and o4-mini[EB/OL]. (2025-04-16)[2025-05-01]. https://openai.com/index/introducing-o3-and-o4-mini.</w:t>
       </w:r>
     </w:p>
     <w:p/>
@@ -17779,6 +18256,7 @@
         <w:sz w:val="21"/>
       </w:rPr>
     </w:pPr>
+    <w:proofErr w:type="spellStart"/>
     <w:r>
       <w:rPr>
         <w:rFonts w:ascii="宋体" w:hAnsi="宋体"/>
@@ -17786,6 +18264,7 @@
       </w:rPr>
       <w:t>创新实践设计报告</w:t>
     </w:r>
+    <w:proofErr w:type="spellEnd"/>
   </w:p>
 </w:hdr>
 </file>

</xml_diff>